<commit_message>
Update CVs with Rocksurv app portfolio and QR links
</commit_message>
<xml_diff>
--- a/public/cv/Aleksei-Pakhalko-CV-EN-2026.docx
+++ b/public/cv/Aleksei-Pakhalko-CV-EN-2026.docx
@@ -99,42 +99,34 @@
         </w:drawing>
       </w:r>
       <w:r>
-        <w:rPr>
-          <w:noProof/>
-        </w:rPr>
         <w:drawing>
-          <wp:anchor distT="0" distB="0" distL="114300" distR="114300" simplePos="0" relativeHeight="251695104" behindDoc="0" locked="0" layoutInCell="1" allowOverlap="1" wp14:anchorId="227F5F25" wp14:editId="7BB5BBF7">
+          <wp:anchor distT="0" distB="0" distL="0" distR="0" simplePos="0" relativeHeight="251660000" behindDoc="0" locked="0" layoutInCell="1" allowOverlap="1">
             <wp:simplePos x="0" y="0"/>
-            <wp:positionH relativeFrom="column">
-              <wp:posOffset>4005580</wp:posOffset>
+            <wp:positionH relativeFrom="page">
+              <wp:posOffset>6228000</wp:posOffset>
             </wp:positionH>
-            <wp:positionV relativeFrom="paragraph">
-              <wp:posOffset>-6350</wp:posOffset>
+            <wp:positionV relativeFrom="page">
+              <wp:posOffset>72000</wp:posOffset>
             </wp:positionV>
-            <wp:extent cx="867410" cy="867410"/>
-            <wp:effectExtent l="0" t="0" r="8890" b="8890"/>
+            <wp:extent cx="1044000" cy="1044000"/>
             <wp:wrapNone/>
-            <wp:docPr id="21" name="图片 4" descr="黑白色的标志&#10;&#10;中度可信度描述已自动生成"/>
-            <wp:cNvGraphicFramePr>
-              <a:graphicFrameLocks xmlns:a="http://schemas.openxmlformats.org/drawingml/2006/main" noChangeAspect="1"/>
+            <wp:docPr id="18" name="Rocksurv portfolio QR" descr="Rocksurv applications and demonstrations: https://tntomg.github.io/en/">
+              <ns0:hlinkClick xmlns:ns0="http://schemas.openxmlformats.org/drawingml/2006/main" r:id="rId18"/>
+            </wp:docPr>
+            <wp:cNvGraphicFramePr xmlns:a="http://schemas.openxmlformats.org/drawingml/2006/main">
+              <a:graphicFrameLocks noChangeAspect="1"/>
             </wp:cNvGraphicFramePr>
-            <a:graphic xmlns:a="http://schemas.openxmlformats.org/drawingml/2006/main">
+            <a:graphic xmlns:a="http://schemas.openxmlformats.org/drawingml/2006/main" xmlns:pic="http://schemas.openxmlformats.org/drawingml/2006/picture">
               <a:graphicData uri="http://schemas.openxmlformats.org/drawingml/2006/picture">
-                <pic:pic xmlns:pic="http://schemas.openxmlformats.org/drawingml/2006/picture">
+                <pic:pic>
                   <pic:nvPicPr>
-                    <pic:cNvPr id="5" name="图片 4" descr="黑白色的标志&#10;&#10;中度可信度描述已自动生成"/>
-                    <pic:cNvPicPr>
-                      <a:picLocks noChangeAspect="1"/>
-                    </pic:cNvPicPr>
+                    <pic:cNvPr id="18" name="rocksurv-portfolio-qr.png">
+                      <a:hlinkClick r:id="rId18"/>
+                    </pic:cNvPr>
+                    <pic:cNvPicPr/>
                   </pic:nvPicPr>
                   <pic:blipFill>
-                    <a:blip r:embed="rId10" cstate="print">
-                      <a:extLst>
-                        <a:ext uri="{28A0092B-C50C-407E-A947-70E740481C1C}">
-                          <a14:useLocalDpi xmlns:a14="http://schemas.microsoft.com/office/drawing/2010/main" val="0"/>
-                        </a:ext>
-                      </a:extLst>
-                    </a:blip>
+                    <a:blip r:embed="rId17"/>
                     <a:stretch>
                       <a:fillRect/>
                     </a:stretch>
@@ -142,148 +134,13 @@
                   <pic:spPr>
                     <a:xfrm>
                       <a:off x="0" y="0"/>
-                      <a:ext cx="867410" cy="867410"/>
+                      <a:ext cx="1044000" cy="1044000"/>
                     </a:xfrm>
-                    <a:prstGeom prst="rect">
-                      <a:avLst/>
-                    </a:prstGeom>
+                    <a:prstGeom prst="rect"/>
                   </pic:spPr>
                 </pic:pic>
               </a:graphicData>
             </a:graphic>
-            <wp14:sizeRelH relativeFrom="margin">
-              <wp14:pctWidth>0</wp14:pctWidth>
-            </wp14:sizeRelH>
-            <wp14:sizeRelV relativeFrom="margin">
-              <wp14:pctHeight>0</wp14:pctHeight>
-            </wp14:sizeRelV>
-          </wp:anchor>
-        </w:drawing>
-      </w:r>
-      <w:r>
-        <w:rPr>
-          <w:rFonts w:ascii="Verdana" w:hAnsi="Verdana"/>
-          <w:b/>
-          <w:bCs/>
-          <w:noProof/>
-          <w:sz w:val="28"/>
-          <w:lang w:val="en-US"/>
-        </w:rPr>
-        <w:drawing>
-          <wp:anchor distT="0" distB="0" distL="114300" distR="114300" simplePos="0" relativeHeight="251693056" behindDoc="0" locked="0" layoutInCell="1" allowOverlap="1" wp14:anchorId="36865F0E" wp14:editId="44C65AF2">
-            <wp:simplePos x="0" y="0"/>
-            <wp:positionH relativeFrom="margin">
-              <wp:posOffset>6271260</wp:posOffset>
-            </wp:positionH>
-            <wp:positionV relativeFrom="paragraph">
-              <wp:posOffset>12700</wp:posOffset>
-            </wp:positionV>
-            <wp:extent cx="714375" cy="848612"/>
-            <wp:effectExtent l="0" t="0" r="0" b="8890"/>
-            <wp:wrapNone/>
-            <wp:docPr id="3" name="Рисунок 21"/>
-            <wp:cNvGraphicFramePr>
-              <a:graphicFrameLocks xmlns:a="http://schemas.openxmlformats.org/drawingml/2006/main" noChangeAspect="1"/>
-            </wp:cNvGraphicFramePr>
-            <a:graphic xmlns:a="http://schemas.openxmlformats.org/drawingml/2006/main">
-              <a:graphicData uri="http://schemas.openxmlformats.org/drawingml/2006/picture">
-                <pic:pic xmlns:pic="http://schemas.openxmlformats.org/drawingml/2006/picture">
-                  <pic:nvPicPr>
-                    <pic:cNvPr id="0" name="Picture 1"/>
-                    <pic:cNvPicPr>
-                      <a:picLocks noChangeAspect="1"/>
-                    </pic:cNvPicPr>
-                  </pic:nvPicPr>
-                  <pic:blipFill>
-                    <a:blip r:embed="rId11"/>
-                    <a:srcRect r="54434"/>
-                    <a:stretch/>
-                  </pic:blipFill>
-                  <pic:spPr bwMode="auto">
-                    <a:xfrm>
-                      <a:off x="0" y="0"/>
-                      <a:ext cx="715394" cy="849822"/>
-                    </a:xfrm>
-                    <a:prstGeom prst="rect">
-                      <a:avLst/>
-                    </a:prstGeom>
-                    <a:noFill/>
-                    <a:ln>
-                      <a:noFill/>
-                      <a:miter/>
-                    </a:ln>
-                  </pic:spPr>
-                </pic:pic>
-              </a:graphicData>
-            </a:graphic>
-            <wp14:sizeRelH relativeFrom="margin">
-              <wp14:pctWidth>0</wp14:pctWidth>
-            </wp14:sizeRelH>
-            <wp14:sizeRelV relativeFrom="margin">
-              <wp14:pctHeight>0</wp14:pctHeight>
-            </wp14:sizeRelV>
-          </wp:anchor>
-        </w:drawing>
-      </w:r>
-      <w:r>
-        <w:rPr>
-          <w:noProof/>
-        </w:rPr>
-        <w:drawing>
-          <wp:anchor distT="0" distB="0" distL="114300" distR="114300" simplePos="0" relativeHeight="251694080" behindDoc="0" locked="0" layoutInCell="1" allowOverlap="1" wp14:anchorId="1217D7DE" wp14:editId="256DD63B">
-            <wp:simplePos x="0" y="0"/>
-            <wp:positionH relativeFrom="column">
-              <wp:posOffset>4956175</wp:posOffset>
-            </wp:positionH>
-            <wp:positionV relativeFrom="paragraph">
-              <wp:posOffset>12700</wp:posOffset>
-            </wp:positionV>
-            <wp:extent cx="1289685" cy="886410"/>
-            <wp:effectExtent l="0" t="0" r="5715" b="9525"/>
-            <wp:wrapNone/>
-            <wp:docPr id="20" name="Picture 4"/>
-            <wp:cNvGraphicFramePr>
-              <a:graphicFrameLocks xmlns:a="http://schemas.openxmlformats.org/drawingml/2006/main" noChangeAspect="1"/>
-            </wp:cNvGraphicFramePr>
-            <a:graphic xmlns:a="http://schemas.openxmlformats.org/drawingml/2006/main">
-              <a:graphicData uri="http://schemas.openxmlformats.org/drawingml/2006/picture">
-                <pic:pic xmlns:pic="http://schemas.openxmlformats.org/drawingml/2006/picture">
-                  <pic:nvPicPr>
-                    <pic:cNvPr id="6" name="Picture 4"/>
-                    <pic:cNvPicPr>
-                      <a:picLocks noChangeAspect="1"/>
-                    </pic:cNvPicPr>
-                  </pic:nvPicPr>
-                  <pic:blipFill>
-                    <a:blip r:embed="rId12" cstate="print">
-                      <a:extLst>
-                        <a:ext uri="{28A0092B-C50C-407E-A947-70E740481C1C}">
-                          <a14:useLocalDpi xmlns:a14="http://schemas.microsoft.com/office/drawing/2010/main" val="0"/>
-                        </a:ext>
-                      </a:extLst>
-                    </a:blip>
-                    <a:stretch>
-                      <a:fillRect/>
-                    </a:stretch>
-                  </pic:blipFill>
-                  <pic:spPr>
-                    <a:xfrm>
-                      <a:off x="0" y="0"/>
-                      <a:ext cx="1289685" cy="886410"/>
-                    </a:xfrm>
-                    <a:prstGeom prst="rect">
-                      <a:avLst/>
-                    </a:prstGeom>
-                  </pic:spPr>
-                </pic:pic>
-              </a:graphicData>
-            </a:graphic>
-            <wp14:sizeRelH relativeFrom="margin">
-              <wp14:pctWidth>0</wp14:pctWidth>
-            </wp14:sizeRelH>
-            <wp14:sizeRelV relativeFrom="margin">
-              <wp14:pctHeight>0</wp14:pctHeight>
-            </wp14:sizeRelV>
           </wp:anchor>
         </w:drawing>
       </w:r>
@@ -377,13 +234,13 @@
           <w:rFonts w:asciiTheme="minorHAnsi" w:hAnsiTheme="minorHAnsi" w:cstheme="minorHAnsi"/>
           <w:color w:val="000000" w:themeColor="text1"/>
         </w:rPr>
-        <w:t>Geological Data Automation &amp; QA/QC Specialist</w:t>
+        <w:t xml:space="preserve">Geology and Rocksurv App Development | QA/QC</w:t>
       </w:r>
     </w:p>
     <w:p>
       <w:pPr>
         <w:pStyle w:val="afa"/>
-        <w:spacing w:before="87"/>
+        <w:spacing w:before="87" w:after="360"/>
         <w:ind w:left="2056" w:right="370"/>
         <w:rPr>
           <w:rFonts w:asciiTheme="minorHAnsi" w:hAnsiTheme="minorHAnsi" w:cstheme="minorHAnsi"/>
@@ -399,8 +256,33 @@
           <w:sz w:val="20"/>
           <w:szCs w:val="20"/>
         </w:rPr>
-        <w:t xml:space="preserve">Senior Geologist with 15+ years of experience in geological mapping, petrography, and geochemistry, specializing in digital workflow automation. Developed expertise in VBA scripting for Excel-based data processing and Android application development during the Arabian Shield Mapping Project (GMAS). Successfully integrated IT solutions into field data collection, validation, and reporting pipelines, reducing manual errors and improving operational efficiency.</w:t>
+        <w:t xml:space="preserve">Senior Geologist with 15+ years of experience in fieldwork, mapping, petrography and geochemistry. I develop Rocksurv applications to accelerate geological data collection, validation and processing, combining geological practice, programming and QA/QC.</w:t>
       </w:r>
+      <w:r>
+        <w:br/>
+      </w:r>
+      <w:r>
+        <w:rPr>
+          <w:rFonts w:asciiTheme="minorHAnsi" w:hAnsiTheme="minorHAnsi" w:cstheme="minorHAnsi"/>
+          <w:color w:val="000000" w:themeColor="text1"/>
+          <w:sz w:val="20"/>
+          <w:szCs w:val="20"/>
+          <w:b/>
+        </w:rPr>
+        <w:t xml:space="preserve">Explore the applications and demonstrations online: </w:t>
+      </w:r>
+      <w:hyperlink r:id="rId18">
+        <w:r>
+          <w:rPr>
+            <w:rFonts w:asciiTheme="minorHAnsi" w:hAnsiTheme="minorHAnsi" w:cstheme="minorHAnsi"/>
+            <w:sz w:val="20"/>
+            <w:szCs w:val="20"/>
+            <w:color w:val="2E6B34"/>
+            <w:u w:val="single"/>
+          </w:rPr>
+          <w:t xml:space="preserve">tntomg.github.io/en/</w:t>
+        </w:r>
+      </w:hyperlink>
     </w:p>
     <w:p>
       <w:pPr>
@@ -429,10 +311,10 @@
               <wp:anchor distT="45720" distB="45720" distL="114300" distR="114300" simplePos="0" relativeHeight="251667456" behindDoc="0" locked="0" layoutInCell="1" allowOverlap="1" wp14:anchorId="43350A38" wp14:editId="7CCFB234">
                 <wp:simplePos x="0" y="0"/>
                 <wp:positionH relativeFrom="column">
-                  <wp:posOffset>4760595</wp:posOffset>
+                  <wp:posOffset>4940595</wp:posOffset>
                 </wp:positionH>
                 <wp:positionV relativeFrom="paragraph">
-                  <wp:posOffset>339090</wp:posOffset>
+                  <wp:posOffset>275590</wp:posOffset>
                 </wp:positionV>
                 <wp:extent cx="1941195" cy="285750"/>
                 <wp:effectExtent l="0" t="0" r="1905" b="0"/>
@@ -510,7 +392,7 @@
                 <v:stroke joinstyle="miter"/>
                 <v:path gradientshapeok="t" o:connecttype="rect"/>
               </v:shapetype>
-              <v:shape id="Надпись 2" o:spid="_x0000_s1026" type="#_x0000_t202" style="position:absolute;left:0;text-align:left;margin-left:374.85pt;margin-top:26.7pt;width:152.85pt;height:22.5pt;z-index:251667456;visibility:visible;mso-wrap-style:square;mso-width-percent:0;mso-height-percent:0;mso-wrap-distance-left:9pt;mso-wrap-distance-top:3.6pt;mso-wrap-distance-right:9pt;mso-wrap-distance-bottom:3.6pt;mso-position-horizontal:absolute;mso-position-horizontal-relative:text;mso-position-vertical:absolute;mso-position-vertical-relative:text;mso-width-percent:0;mso-height-percent:0;mso-width-relative:margin;mso-height-relative:margin;v-text-anchor:top" o:gfxdata="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" stroked="f">
+              <v:shape id="Надпись 2" o:spid="_x0000_s1026" type="#_x0000_t202" style="position:absolute;left:0;text-align:left;margin-left:389.023228pt;margin-top:21.7pt;width:152.85pt;height:22.5pt;z-index:251667456;visibility:visible;mso-wrap-style:square;mso-width-percent:0;mso-height-percent:0;mso-wrap-distance-left:9pt;mso-wrap-distance-top:3.6pt;mso-wrap-distance-right:9pt;mso-wrap-distance-bottom:3.6pt;mso-position-horizontal:absolute;mso-position-horizontal-relative:text;mso-position-vertical:absolute;mso-position-vertical-relative:text;mso-width-percent:0;mso-height-percent:0;mso-width-relative:margin;mso-height-relative:margin;v-text-anchor:top" o:gfxdata="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" stroked="f">
                 <v:textbox>
                   <w:txbxContent>
                     <w:p>
@@ -2097,24 +1979,7 @@
                                 <w:sz w:val="22"/>
                                 <w:szCs w:val="22"/>
                               </w:rPr>
-                              <w:t>+7 (9</w:t>
-                            </w:r>
-                            <w:r>
-                              <w:rPr>
-                                <w:rFonts w:asciiTheme="minorHAnsi" w:eastAsia="Arial" w:hAnsiTheme="minorHAnsi" w:cstheme="minorHAnsi"/>
-                                <w:sz w:val="22"/>
-                                <w:szCs w:val="22"/>
-                                <w:lang w:val="en-US"/>
-                              </w:rPr>
-                              <w:t>04</w:t>
-                            </w:r>
-                            <w:r>
-                              <w:rPr>
-                                <w:rFonts w:asciiTheme="minorHAnsi" w:eastAsia="Arial" w:hAnsiTheme="minorHAnsi" w:cstheme="minorHAnsi"/>
-                                <w:sz w:val="22"/>
-                                <w:szCs w:val="22"/>
-                              </w:rPr>
-                              <w:t>) 6374416 / +7 (927) 2344525</w:t>
+                              <w:t xml:space="preserve">+7 904 637-44-16 / +7 927 234-45-25</w:t>
                             </w:r>
                           </w:p>
                         </w:txbxContent>
@@ -2154,24 +2019,7 @@
                           <w:sz w:val="22"/>
                           <w:szCs w:val="22"/>
                         </w:rPr>
-                        <w:t>+7 (9</w:t>
-                      </w:r>
-                      <w:r>
-                        <w:rPr>
-                          <w:rFonts w:asciiTheme="minorHAnsi" w:eastAsia="Arial" w:hAnsiTheme="minorHAnsi" w:cstheme="minorHAnsi"/>
-                          <w:sz w:val="22"/>
-                          <w:szCs w:val="22"/>
-                          <w:lang w:val="en-US"/>
-                        </w:rPr>
-                        <w:t>04</w:t>
-                      </w:r>
-                      <w:r>
-                        <w:rPr>
-                          <w:rFonts w:asciiTheme="minorHAnsi" w:eastAsia="Arial" w:hAnsiTheme="minorHAnsi" w:cstheme="minorHAnsi"/>
-                          <w:sz w:val="22"/>
-                          <w:szCs w:val="22"/>
-                        </w:rPr>
-                        <w:t>) 6374416 / +7 (927) 2344525</w:t>
+                        <w:t xml:space="preserve">+7 904 637-44-16 / +7 927 234-45-25</w:t>
                       </w:r>
                     </w:p>
                   </w:txbxContent>
@@ -2309,6 +2157,189 @@
                       </wps:spPr>
                       <wps:txbx>
                         <w:txbxContent>
+                          <w:p>
+                            <w:pPr>
+                              <w:pStyle w:val="15"/>
+                              <w:spacing w:after="120" w:line="240" w:lineRule="auto" w:before="0"/>
+                              <w:rPr>
+                                <w:rFonts w:asciiTheme="minorHAnsi" w:hAnsiTheme="minorHAnsi" w:cstheme="minorHAnsi"/>
+                                <w:b/>
+                                <w:bCs/>
+                                <w:color w:val="000000" w:themeColor="text1"/>
+                                <w:sz w:val="28"/>
+                                <w:lang w:val="en-US"/>
+                              </w:rPr>
+                            </w:pPr>
+                            <w:r>
+                              <w:rPr>
+                                <w:rFonts w:asciiTheme="minorHAnsi" w:hAnsiTheme="minorHAnsi" w:cstheme="minorHAnsi"/>
+                                <w:color w:val="000000" w:themeColor="text1"/>
+                                <w:sz w:val="28"/>
+                                <w:lang w:val="en-US"/>
+                                <w:b/>
+                              </w:rPr>
+                              <w:t xml:space="preserve">ROCKSURV APPLICATIONS</w:t>
+                            </w:r>
+                          </w:p>
+                          <w:p>
+                            <w:pPr>
+                              <w:pStyle w:val="15"/>
+                              <w:spacing w:before="0" w:line="240" w:lineRule="auto" w:after="100"/>
+                              <w:rPr>
+                                <w:rFonts w:asciiTheme="minorHAnsi" w:hAnsiTheme="minorHAnsi" w:cstheme="minorHAnsi"/>
+                                <w:color w:val="000000" w:themeColor="text1"/>
+                                <w:sz w:val="20"/>
+                                <w:szCs w:val="20"/>
+                                <w:lang w:val="en-US"/>
+                              </w:rPr>
+                            </w:pPr>
+                            <w:r>
+                              <w:rPr>
+                                <w:rFonts w:asciiTheme="minorHAnsi" w:hAnsiTheme="minorHAnsi" w:cstheme="minorHAnsi"/>
+                                <w:color w:val="000000" w:themeColor="text1"/>
+                                <w:sz w:val="20"/>
+                                <w:szCs w:val="20"/>
+                                <w:lang w:val="en-US"/>
+                                <w:b/>
+                              </w:rPr>
+                              <w:t xml:space="preserve">Rocksurv Field</w:t>
+                            </w:r>
+                            <w:r>
+                              <w:rPr>
+                                <w:rFonts w:asciiTheme="minorHAnsi" w:hAnsiTheme="minorHAnsi" w:cstheme="minorHAnsi"/>
+                                <w:color w:val="000000" w:themeColor="text1"/>
+                                <w:sz w:val="20"/>
+                                <w:szCs w:val="20"/>
+                                <w:lang w:val="en-US"/>
+                              </w:rPr>
+                              <w:t xml:space="preserve">: field observations, sampling and offline maps.</w:t>
+                            </w:r>
+                          </w:p>
+                          <w:p>
+                            <w:pPr>
+                              <w:pStyle w:val="15"/>
+                              <w:spacing w:before="0" w:line="240" w:lineRule="auto" w:after="100"/>
+                              <w:rPr>
+                                <w:rFonts w:asciiTheme="minorHAnsi" w:hAnsiTheme="minorHAnsi" w:cstheme="minorHAnsi"/>
+                                <w:color w:val="000000" w:themeColor="text1"/>
+                                <w:sz w:val="20"/>
+                                <w:szCs w:val="20"/>
+                                <w:lang w:val="en-US"/>
+                              </w:rPr>
+                            </w:pPr>
+                            <w:r>
+                              <w:rPr>
+                                <w:rFonts w:asciiTheme="minorHAnsi" w:hAnsiTheme="minorHAnsi" w:cstheme="minorHAnsi"/>
+                                <w:color w:val="000000" w:themeColor="text1"/>
+                                <w:sz w:val="20"/>
+                                <w:szCs w:val="20"/>
+                                <w:lang w:val="en-US"/>
+                                <w:b/>
+                              </w:rPr>
+                              <w:t xml:space="preserve">Rocksurv Classifier</w:t>
+                            </w:r>
+                            <w:r>
+                              <w:rPr>
+                                <w:rFonts w:asciiTheme="minorHAnsi" w:hAnsiTheme="minorHAnsi" w:cstheme="minorHAnsi"/>
+                                <w:color w:val="000000" w:themeColor="text1"/>
+                                <w:sz w:val="20"/>
+                                <w:szCs w:val="20"/>
+                                <w:lang w:val="en-US"/>
+                              </w:rPr>
+                              <w:t xml:space="preserve">: rock classification and structural measurement validation.</w:t>
+                            </w:r>
+                          </w:p>
+                          <w:p>
+                            <w:pPr>
+                              <w:pStyle w:val="15"/>
+                              <w:spacing w:before="0" w:line="240" w:lineRule="auto" w:after="100"/>
+                              <w:rPr>
+                                <w:rFonts w:asciiTheme="minorHAnsi" w:hAnsiTheme="minorHAnsi" w:cstheme="minorHAnsi"/>
+                                <w:color w:val="000000" w:themeColor="text1"/>
+                                <w:sz w:val="20"/>
+                                <w:szCs w:val="20"/>
+                                <w:lang w:val="en-US"/>
+                              </w:rPr>
+                            </w:pPr>
+                            <w:r>
+                              <w:rPr>
+                                <w:rFonts w:asciiTheme="minorHAnsi" w:hAnsiTheme="minorHAnsi" w:cstheme="minorHAnsi"/>
+                                <w:color w:val="000000" w:themeColor="text1"/>
+                                <w:sz w:val="20"/>
+                                <w:szCs w:val="20"/>
+                                <w:lang w:val="en-US"/>
+                                <w:b/>
+                              </w:rPr>
+                              <w:t xml:space="preserve">Rocksurv Core</w:t>
+                            </w:r>
+                            <w:r>
+                              <w:rPr>
+                                <w:rFonts w:asciiTheme="minorHAnsi" w:hAnsiTheme="minorHAnsi" w:cstheme="minorHAnsi"/>
+                                <w:color w:val="000000" w:themeColor="text1"/>
+                                <w:sz w:val="20"/>
+                                <w:szCs w:val="20"/>
+                                <w:lang w:val="en-US"/>
+                              </w:rPr>
+                              <w:t xml:space="preserve">: digital drill-core and mine-workings documentation.</w:t>
+                            </w:r>
+                          </w:p>
+                          <w:p>
+                            <w:pPr>
+                              <w:pStyle w:val="15"/>
+                              <w:spacing w:before="0" w:line="240" w:lineRule="auto" w:after="100"/>
+                              <w:rPr>
+                                <w:rFonts w:asciiTheme="minorHAnsi" w:hAnsiTheme="minorHAnsi" w:cstheme="minorHAnsi"/>
+                                <w:color w:val="000000" w:themeColor="text1"/>
+                                <w:sz w:val="20"/>
+                                <w:szCs w:val="20"/>
+                                <w:lang w:val="en-US"/>
+                              </w:rPr>
+                            </w:pPr>
+                            <w:r>
+                              <w:rPr>
+                                <w:rFonts w:asciiTheme="minorHAnsi" w:hAnsiTheme="minorHAnsi" w:cstheme="minorHAnsi"/>
+                                <w:color w:val="000000" w:themeColor="text1"/>
+                                <w:sz w:val="20"/>
+                                <w:szCs w:val="20"/>
+                                <w:lang w:val="en-US"/>
+                                <w:b/>
+                              </w:rPr>
+                              <w:t xml:space="preserve">RockSurv Petrography</w:t>
+                            </w:r>
+                            <w:r>
+                              <w:rPr>
+                                <w:rFonts w:asciiTheme="minorHAnsi" w:hAnsiTheme="minorHAnsi" w:cstheme="minorHAnsi"/>
+                                <w:color w:val="000000" w:themeColor="text1"/>
+                                <w:sz w:val="20"/>
+                                <w:szCs w:val="20"/>
+                                <w:lang w:val="en-US"/>
+                              </w:rPr>
+                              <w:t xml:space="preserve">: microscopic mineral identification and a thin-section atlas.</w:t>
+                            </w:r>
+                          </w:p>
+                          <w:p>
+                            <w:pPr>
+                              <w:pStyle w:val="15"/>
+                              <w:spacing w:before="0" w:line="240" w:lineRule="auto" w:after="100"/>
+                              <w:rPr>
+                                <w:rFonts w:asciiTheme="minorHAnsi" w:hAnsiTheme="minorHAnsi" w:cstheme="minorHAnsi"/>
+                                <w:color w:val="000000" w:themeColor="text1"/>
+                                <w:sz w:val="20"/>
+                                <w:szCs w:val="20"/>
+                                <w:lang w:val="en-US"/>
+                              </w:rPr>
+                            </w:pPr>
+                            <w:r>
+                              <w:rPr>
+                                <w:rFonts w:asciiTheme="minorHAnsi" w:hAnsiTheme="minorHAnsi" w:cstheme="minorHAnsi"/>
+                                <w:color w:val="000000" w:themeColor="text1"/>
+                                <w:sz w:val="20"/>
+                                <w:szCs w:val="20"/>
+                                <w:lang w:val="en-US"/>
+                              </w:rPr>
+                              <w:t xml:space="preserve">Prototypes in development. Workflows and demonstrations are available online.</w:t>
+                            </w:r>
+                          </w:p>
                           <w:p>
                             <w:pPr>
                               <w:pStyle w:val="15"/>
@@ -2505,357 +2536,6 @@
                               <w:t xml:space="preserve"> Russian (Native), English (Upper-Intermediate), Chinese (HSK 3, Pre-Intermediate).</w:t>
                             </w:r>
                           </w:p>
-                          <w:p>
-                            <w:pPr>
-                              <w:pStyle w:val="15"/>
-                              <w:spacing w:before="240" w:after="240" w:line="240" w:lineRule="auto"/>
-                              <w:rPr>
-                                <w:rFonts w:asciiTheme="minorHAnsi" w:hAnsiTheme="minorHAnsi" w:cstheme="minorHAnsi"/>
-                                <w:b/>
-                                <w:bCs/>
-                                <w:color w:val="000000" w:themeColor="text1"/>
-                                <w:sz w:val="28"/>
-                                <w:lang w:val="en-US"/>
-                              </w:rPr>
-                            </w:pPr>
-                            <w:r>
-                              <w:rPr>
-                                <w:rFonts w:asciiTheme="minorHAnsi" w:hAnsiTheme="minorHAnsi" w:cstheme="minorHAnsi"/>
-                                <w:b/>
-                                <w:bCs/>
-                                <w:color w:val="000000" w:themeColor="text1"/>
-                                <w:sz w:val="28"/>
-                                <w:lang w:val="en-US"/>
-                              </w:rPr>
-                              <w:t>Education</w:t>
-                            </w:r>
-                          </w:p>
-                          <w:p>
-                            <w:pPr>
-                              <w:pStyle w:val="15"/>
-                              <w:spacing w:line="240" w:lineRule="auto"/>
-                              <w:rPr>
-                                <w:rFonts w:asciiTheme="minorHAnsi" w:hAnsiTheme="minorHAnsi" w:cstheme="minorHAnsi"/>
-                                <w:b/>
-                                <w:bCs/>
-                                <w:color w:val="000000" w:themeColor="text1"/>
-                                <w:sz w:val="20"/>
-                                <w:szCs w:val="20"/>
-                                <w:lang w:val="en-US"/>
-                              </w:rPr>
-                            </w:pPr>
-                            <w:r>
-                              <w:rPr>
-                                <w:rFonts w:asciiTheme="minorHAnsi" w:hAnsiTheme="minorHAnsi" w:cstheme="minorHAnsi"/>
-                                <w:b/>
-                                <w:bCs/>
-                                <w:color w:val="000000" w:themeColor="text1"/>
-                                <w:sz w:val="20"/>
-                                <w:szCs w:val="20"/>
-                                <w:lang w:val="en-US"/>
-                              </w:rPr>
-                              <w:t>2023, Yandex academy</w:t>
-                            </w:r>
-                          </w:p>
-                          <w:p>
-                            <w:pPr>
-                              <w:pStyle w:val="15"/>
-                              <w:spacing w:line="240" w:lineRule="auto"/>
-                              <w:rPr>
-                                <w:rFonts w:asciiTheme="minorHAnsi" w:hAnsiTheme="minorHAnsi" w:cstheme="minorHAnsi"/>
-                                <w:b/>
-                                <w:bCs/>
-                                <w:color w:val="000000" w:themeColor="text1"/>
-                                <w:sz w:val="20"/>
-                                <w:szCs w:val="20"/>
-                                <w:lang w:val="en-US"/>
-                              </w:rPr>
-                            </w:pPr>
-                            <w:r>
-                              <w:rPr>
-                                <w:rFonts w:asciiTheme="minorHAnsi" w:hAnsiTheme="minorHAnsi" w:cstheme="minorHAnsi"/>
-                                <w:b/>
-                                <w:bCs/>
-                                <w:color w:val="000000" w:themeColor="text1"/>
-                                <w:sz w:val="20"/>
-                                <w:szCs w:val="20"/>
-                                <w:lang w:val="en-US"/>
-                              </w:rPr>
-                              <w:t>QAQC engineer</w:t>
-                            </w:r>
-                          </w:p>
-                          <w:p>
-                            <w:pPr>
-                              <w:pStyle w:val="15"/>
-                              <w:spacing w:line="240" w:lineRule="auto"/>
-                              <w:rPr>
-                                <w:rFonts w:asciiTheme="minorHAnsi" w:hAnsiTheme="minorHAnsi" w:cstheme="minorHAnsi"/>
-                                <w:color w:val="000000" w:themeColor="text1"/>
-                                <w:sz w:val="20"/>
-                                <w:szCs w:val="20"/>
-                                <w:lang w:val="en-US"/>
-                              </w:rPr>
-                            </w:pPr>
-                            <w:r>
-                              <w:rPr>
-                                <w:rFonts w:asciiTheme="minorHAnsi" w:hAnsiTheme="minorHAnsi" w:cstheme="minorHAnsi"/>
-                                <w:color w:val="000000" w:themeColor="text1"/>
-                                <w:sz w:val="20"/>
-                                <w:szCs w:val="20"/>
-                                <w:lang w:val="en-US"/>
-                              </w:rPr>
-                              <w:t>Specialization: Web/mobile application testing, API testing, SQL, test automation fundamentals</w:t>
-                            </w:r>
-                          </w:p>
-                          <w:p>
-                            <w:pPr>
-                              <w:pStyle w:val="15"/>
-                              <w:spacing w:line="240" w:lineRule="auto"/>
-                              <w:rPr>
-                                <w:rFonts w:asciiTheme="minorHAnsi" w:hAnsiTheme="minorHAnsi" w:cstheme="minorHAnsi"/>
-                                <w:b/>
-                                <w:bCs/>
-                                <w:color w:val="000000" w:themeColor="text1"/>
-                                <w:sz w:val="20"/>
-                                <w:szCs w:val="20"/>
-                                <w:lang w:val="en-US"/>
-                              </w:rPr>
-                            </w:pPr>
-                          </w:p>
-                          <w:p>
-                            <w:pPr>
-                              <w:pStyle w:val="15"/>
-                              <w:spacing w:line="240" w:lineRule="auto"/>
-                              <w:rPr>
-                                <w:rFonts w:asciiTheme="minorHAnsi" w:hAnsiTheme="minorHAnsi" w:cstheme="minorHAnsi"/>
-                                <w:b/>
-                                <w:bCs/>
-                                <w:color w:val="000000" w:themeColor="text1"/>
-                                <w:sz w:val="20"/>
-                                <w:szCs w:val="20"/>
-                                <w:lang w:val="en-US"/>
-                              </w:rPr>
-                            </w:pPr>
-                            <w:r>
-                              <w:rPr>
-                                <w:rFonts w:asciiTheme="minorHAnsi" w:hAnsiTheme="minorHAnsi" w:cstheme="minorHAnsi"/>
-                                <w:b/>
-                                <w:bCs/>
-                                <w:color w:val="000000" w:themeColor="text1"/>
-                                <w:sz w:val="20"/>
-                                <w:szCs w:val="20"/>
-                                <w:lang w:val="en-US"/>
-                              </w:rPr>
-                              <w:t>2010-2014, Saint Petersburg</w:t>
-                            </w:r>
-                          </w:p>
-                          <w:p>
-                            <w:pPr>
-                              <w:pStyle w:val="15"/>
-                              <w:spacing w:line="240" w:lineRule="auto"/>
-                              <w:rPr>
-                                <w:rFonts w:asciiTheme="minorHAnsi" w:hAnsiTheme="minorHAnsi" w:cstheme="minorHAnsi"/>
-                                <w:b/>
-                                <w:bCs/>
-                                <w:color w:val="000000" w:themeColor="text1"/>
-                                <w:sz w:val="20"/>
-                                <w:szCs w:val="20"/>
-                                <w:lang w:val="en-US"/>
-                              </w:rPr>
-                            </w:pPr>
-                            <w:r>
-                              <w:rPr>
-                                <w:rFonts w:asciiTheme="minorHAnsi" w:hAnsiTheme="minorHAnsi" w:cstheme="minorHAnsi"/>
-                                <w:b/>
-                                <w:bCs/>
-                                <w:color w:val="000000" w:themeColor="text1"/>
-                                <w:sz w:val="20"/>
-                                <w:szCs w:val="20"/>
-                                <w:lang w:val="en-US"/>
-                              </w:rPr>
-                              <w:t xml:space="preserve">Postgraduate education </w:t>
-                            </w:r>
-                          </w:p>
-                          <w:p>
-                            <w:pPr>
-                              <w:pStyle w:val="15"/>
-                              <w:spacing w:line="240" w:lineRule="auto"/>
-                              <w:rPr>
-                                <w:rFonts w:asciiTheme="minorHAnsi" w:hAnsiTheme="minorHAnsi" w:cstheme="minorHAnsi"/>
-                                <w:color w:val="000000" w:themeColor="text1"/>
-                                <w:sz w:val="20"/>
-                                <w:szCs w:val="20"/>
-                                <w:lang w:val="en-US"/>
-                              </w:rPr>
-                            </w:pPr>
-                            <w:r>
-                              <w:rPr>
-                                <w:rFonts w:asciiTheme="minorHAnsi" w:hAnsiTheme="minorHAnsi" w:cstheme="minorHAnsi"/>
-                                <w:color w:val="000000" w:themeColor="text1"/>
-                                <w:sz w:val="20"/>
-                                <w:szCs w:val="20"/>
-                                <w:lang w:val="en-US"/>
-                              </w:rPr>
-                              <w:t>Karpinsky Russian Geological Research Institute (Karpinsky Institute, VSEGEI)</w:t>
-                            </w:r>
-                          </w:p>
-                          <w:p>
-                            <w:pPr>
-                              <w:pStyle w:val="15"/>
-                              <w:spacing w:line="240" w:lineRule="auto"/>
-                              <w:rPr>
-                                <w:rFonts w:asciiTheme="minorHAnsi" w:hAnsiTheme="minorHAnsi" w:cstheme="minorHAnsi"/>
-                                <w:color w:val="000000" w:themeColor="text1"/>
-                                <w:sz w:val="20"/>
-                                <w:szCs w:val="20"/>
-                                <w:lang w:val="en-US"/>
-                              </w:rPr>
-                            </w:pPr>
-                            <w:r>
-                              <w:rPr>
-                                <w:rFonts w:asciiTheme="minorHAnsi" w:hAnsiTheme="minorHAnsi" w:cstheme="minorHAnsi"/>
-                                <w:color w:val="000000" w:themeColor="text1"/>
-                                <w:sz w:val="20"/>
-                                <w:szCs w:val="20"/>
-                                <w:lang w:val="en-US"/>
-                              </w:rPr>
-                              <w:t>Specialization: Geology, Geological survey and Minerageny</w:t>
-                            </w:r>
-                          </w:p>
-                          <w:p>
-                            <w:pPr>
-                              <w:pStyle w:val="15"/>
-                              <w:spacing w:line="240" w:lineRule="auto"/>
-                              <w:rPr>
-                                <w:rFonts w:asciiTheme="minorHAnsi" w:hAnsiTheme="minorHAnsi" w:cstheme="minorHAnsi"/>
-                                <w:color w:val="000000" w:themeColor="text1"/>
-                                <w:sz w:val="20"/>
-                                <w:szCs w:val="20"/>
-                                <w:lang w:val="en-US"/>
-                              </w:rPr>
-                            </w:pPr>
-                          </w:p>
-                          <w:p>
-                            <w:pPr>
-                              <w:pStyle w:val="15"/>
-                              <w:spacing w:line="240" w:lineRule="auto"/>
-                              <w:rPr>
-                                <w:rFonts w:asciiTheme="minorHAnsi" w:hAnsiTheme="minorHAnsi" w:cstheme="minorHAnsi"/>
-                                <w:b/>
-                                <w:bCs/>
-                                <w:color w:val="000000" w:themeColor="text1"/>
-                                <w:sz w:val="20"/>
-                                <w:szCs w:val="20"/>
-                                <w:lang w:val="en-US"/>
-                              </w:rPr>
-                            </w:pPr>
-                            <w:r>
-                              <w:rPr>
-                                <w:rFonts w:asciiTheme="minorHAnsi" w:hAnsiTheme="minorHAnsi" w:cstheme="minorHAnsi"/>
-                                <w:b/>
-                                <w:bCs/>
-                                <w:color w:val="000000" w:themeColor="text1"/>
-                                <w:sz w:val="20"/>
-                                <w:szCs w:val="20"/>
-                                <w:lang w:val="en-US"/>
-                              </w:rPr>
-                              <w:t>2005 – 2010, Saint Petersburg</w:t>
-                            </w:r>
-                          </w:p>
-                          <w:p>
-                            <w:pPr>
-                              <w:pStyle w:val="15"/>
-                              <w:spacing w:line="240" w:lineRule="auto"/>
-                              <w:rPr>
-                                <w:rFonts w:asciiTheme="minorHAnsi" w:hAnsiTheme="minorHAnsi" w:cstheme="minorHAnsi"/>
-                                <w:b/>
-                                <w:bCs/>
-                                <w:color w:val="000000" w:themeColor="text1"/>
-                                <w:sz w:val="20"/>
-                                <w:szCs w:val="20"/>
-                                <w:lang w:val="en-US"/>
-                              </w:rPr>
-                            </w:pPr>
-                            <w:r>
-                              <w:rPr>
-                                <w:rFonts w:asciiTheme="minorHAnsi" w:hAnsiTheme="minorHAnsi" w:cstheme="minorHAnsi"/>
-                                <w:b/>
-                                <w:bCs/>
-                                <w:color w:val="000000" w:themeColor="text1"/>
-                                <w:sz w:val="20"/>
-                                <w:szCs w:val="20"/>
-                                <w:lang w:val="en-US"/>
-                              </w:rPr>
-                              <w:t>Mining engineer</w:t>
-                            </w:r>
-                          </w:p>
-                          <w:p>
-                            <w:pPr>
-                              <w:pStyle w:val="15"/>
-                              <w:spacing w:line="240" w:lineRule="auto"/>
-                              <w:rPr>
-                                <w:rFonts w:asciiTheme="minorHAnsi" w:hAnsiTheme="minorHAnsi" w:cstheme="minorHAnsi"/>
-                                <w:color w:val="000000" w:themeColor="text1"/>
-                                <w:sz w:val="20"/>
-                                <w:szCs w:val="20"/>
-                                <w:lang w:val="en-US"/>
-                              </w:rPr>
-                            </w:pPr>
-                            <w:r>
-                              <w:rPr>
-                                <w:rFonts w:asciiTheme="minorHAnsi" w:hAnsiTheme="minorHAnsi" w:cstheme="minorHAnsi"/>
-                                <w:color w:val="000000" w:themeColor="text1"/>
-                                <w:sz w:val="20"/>
-                                <w:szCs w:val="20"/>
-                                <w:lang w:val="en-US"/>
-                              </w:rPr>
-                              <w:t xml:space="preserve">Saint Petersburg Mining University </w:t>
-                            </w:r>
-                          </w:p>
-                          <w:p>
-                            <w:pPr>
-                              <w:pStyle w:val="15"/>
-                              <w:spacing w:line="240" w:lineRule="auto"/>
-                              <w:rPr>
-                                <w:rFonts w:asciiTheme="minorHAnsi" w:hAnsiTheme="minorHAnsi" w:cstheme="minorHAnsi"/>
-                                <w:color w:val="000000" w:themeColor="text1"/>
-                                <w:sz w:val="20"/>
-                                <w:szCs w:val="20"/>
-                                <w:lang w:val="en-US"/>
-                              </w:rPr>
-                            </w:pPr>
-                            <w:r>
-                              <w:rPr>
-                                <w:rFonts w:asciiTheme="minorHAnsi" w:hAnsiTheme="minorHAnsi" w:cstheme="minorHAnsi"/>
-                                <w:color w:val="000000" w:themeColor="text1"/>
-                                <w:sz w:val="20"/>
-                                <w:szCs w:val="20"/>
-                                <w:lang w:val="en-US"/>
-                              </w:rPr>
-                              <w:t xml:space="preserve">Specialization: Mineralogy, petrography and applied geochemistry </w:t>
-                            </w:r>
-                          </w:p>
-                          <w:p>
-                            <w:pPr>
-                              <w:pStyle w:val="15"/>
-                              <w:spacing w:line="240" w:lineRule="auto"/>
-                              <w:rPr>
-                                <w:rFonts w:asciiTheme="minorHAnsi" w:hAnsiTheme="minorHAnsi" w:cstheme="minorHAnsi"/>
-                                <w:color w:val="000000" w:themeColor="text1"/>
-                                <w:sz w:val="28"/>
-                                <w:lang w:val="en-US"/>
-                              </w:rPr>
-                            </w:pPr>
-                          </w:p>
-                          <w:p>
-                            <w:pPr>
-                              <w:rPr>
-                                <w:rFonts w:asciiTheme="minorHAnsi" w:hAnsiTheme="minorHAnsi" w:cstheme="minorHAnsi"/>
-                                <w:color w:val="000000" w:themeColor="text1"/>
-                                <w:lang w:val="en-US"/>
-                              </w:rPr>
-                            </w:pPr>
-                          </w:p>
                         </w:txbxContent>
                       </wps:txbx>
                       <wps:bodyPr rot="0" vert="horz" wrap="square" lIns="91440" tIns="45720" rIns="91440" bIns="45720" anchor="t" anchorCtr="0">
@@ -2878,6 +2558,189 @@
               <v:shape w14:anchorId="3489E301" id="_x0000_s1029" type="#_x0000_t202" style="position:absolute;margin-left:-21.85pt;margin-top:37.85pt;width:211.3pt;height:572.8pt;z-index:251669504;visibility:visible;mso-wrap-style:square;mso-width-percent:0;mso-height-percent:0;mso-wrap-distance-left:9pt;mso-wrap-distance-top:3.6pt;mso-wrap-distance-right:9pt;mso-wrap-distance-bottom:3.6pt;mso-position-horizontal:absolute;mso-position-horizontal-relative:text;mso-position-vertical:absolute;mso-position-vertical-relative:text;mso-width-percent:0;mso-height-percent:0;mso-width-relative:margin;mso-height-relative:margin;v-text-anchor:top" o:gfxdata="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" stroked="f">
                 <v:textbox>
                   <w:txbxContent>
+                    <w:p>
+                      <w:pPr>
+                        <w:pStyle w:val="15"/>
+                        <w:spacing w:after="120" w:line="240" w:lineRule="auto" w:before="0"/>
+                        <w:rPr>
+                          <w:rFonts w:asciiTheme="minorHAnsi" w:hAnsiTheme="minorHAnsi" w:cstheme="minorHAnsi"/>
+                          <w:b/>
+                          <w:bCs/>
+                          <w:color w:val="000000" w:themeColor="text1"/>
+                          <w:sz w:val="28"/>
+                          <w:lang w:val="en-US"/>
+                        </w:rPr>
+                      </w:pPr>
+                      <w:r>
+                        <w:rPr>
+                          <w:rFonts w:asciiTheme="minorHAnsi" w:hAnsiTheme="minorHAnsi" w:cstheme="minorHAnsi"/>
+                          <w:color w:val="000000" w:themeColor="text1"/>
+                          <w:sz w:val="28"/>
+                          <w:lang w:val="en-US"/>
+                          <w:b/>
+                        </w:rPr>
+                        <w:t xml:space="preserve">ROCKSURV APPLICATIONS</w:t>
+                      </w:r>
+                    </w:p>
+                    <w:p>
+                      <w:pPr>
+                        <w:pStyle w:val="15"/>
+                        <w:spacing w:before="0" w:line="240" w:lineRule="auto" w:after="100"/>
+                        <w:rPr>
+                          <w:rFonts w:asciiTheme="minorHAnsi" w:hAnsiTheme="minorHAnsi" w:cstheme="minorHAnsi"/>
+                          <w:color w:val="000000" w:themeColor="text1"/>
+                          <w:sz w:val="20"/>
+                          <w:szCs w:val="20"/>
+                          <w:lang w:val="en-US"/>
+                        </w:rPr>
+                      </w:pPr>
+                      <w:r>
+                        <w:rPr>
+                          <w:rFonts w:asciiTheme="minorHAnsi" w:hAnsiTheme="minorHAnsi" w:cstheme="minorHAnsi"/>
+                          <w:color w:val="000000" w:themeColor="text1"/>
+                          <w:sz w:val="20"/>
+                          <w:szCs w:val="20"/>
+                          <w:lang w:val="en-US"/>
+                          <w:b/>
+                        </w:rPr>
+                        <w:t xml:space="preserve">Rocksurv Field</w:t>
+                      </w:r>
+                      <w:r>
+                        <w:rPr>
+                          <w:rFonts w:asciiTheme="minorHAnsi" w:hAnsiTheme="minorHAnsi" w:cstheme="minorHAnsi"/>
+                          <w:color w:val="000000" w:themeColor="text1"/>
+                          <w:sz w:val="20"/>
+                          <w:szCs w:val="20"/>
+                          <w:lang w:val="en-US"/>
+                        </w:rPr>
+                        <w:t xml:space="preserve">: field observations, sampling and offline maps.</w:t>
+                      </w:r>
+                    </w:p>
+                    <w:p>
+                      <w:pPr>
+                        <w:pStyle w:val="15"/>
+                        <w:spacing w:before="0" w:line="240" w:lineRule="auto" w:after="100"/>
+                        <w:rPr>
+                          <w:rFonts w:asciiTheme="minorHAnsi" w:hAnsiTheme="minorHAnsi" w:cstheme="minorHAnsi"/>
+                          <w:color w:val="000000" w:themeColor="text1"/>
+                          <w:sz w:val="20"/>
+                          <w:szCs w:val="20"/>
+                          <w:lang w:val="en-US"/>
+                        </w:rPr>
+                      </w:pPr>
+                      <w:r>
+                        <w:rPr>
+                          <w:rFonts w:asciiTheme="minorHAnsi" w:hAnsiTheme="minorHAnsi" w:cstheme="minorHAnsi"/>
+                          <w:color w:val="000000" w:themeColor="text1"/>
+                          <w:sz w:val="20"/>
+                          <w:szCs w:val="20"/>
+                          <w:lang w:val="en-US"/>
+                          <w:b/>
+                        </w:rPr>
+                        <w:t xml:space="preserve">Rocksurv Classifier</w:t>
+                      </w:r>
+                      <w:r>
+                        <w:rPr>
+                          <w:rFonts w:asciiTheme="minorHAnsi" w:hAnsiTheme="minorHAnsi" w:cstheme="minorHAnsi"/>
+                          <w:color w:val="000000" w:themeColor="text1"/>
+                          <w:sz w:val="20"/>
+                          <w:szCs w:val="20"/>
+                          <w:lang w:val="en-US"/>
+                        </w:rPr>
+                        <w:t xml:space="preserve">: rock classification and structural measurement validation.</w:t>
+                      </w:r>
+                    </w:p>
+                    <w:p>
+                      <w:pPr>
+                        <w:pStyle w:val="15"/>
+                        <w:spacing w:before="0" w:line="240" w:lineRule="auto" w:after="100"/>
+                        <w:rPr>
+                          <w:rFonts w:asciiTheme="minorHAnsi" w:hAnsiTheme="minorHAnsi" w:cstheme="minorHAnsi"/>
+                          <w:color w:val="000000" w:themeColor="text1"/>
+                          <w:sz w:val="20"/>
+                          <w:szCs w:val="20"/>
+                          <w:lang w:val="en-US"/>
+                        </w:rPr>
+                      </w:pPr>
+                      <w:r>
+                        <w:rPr>
+                          <w:rFonts w:asciiTheme="minorHAnsi" w:hAnsiTheme="minorHAnsi" w:cstheme="minorHAnsi"/>
+                          <w:color w:val="000000" w:themeColor="text1"/>
+                          <w:sz w:val="20"/>
+                          <w:szCs w:val="20"/>
+                          <w:lang w:val="en-US"/>
+                          <w:b/>
+                        </w:rPr>
+                        <w:t xml:space="preserve">Rocksurv Core</w:t>
+                      </w:r>
+                      <w:r>
+                        <w:rPr>
+                          <w:rFonts w:asciiTheme="minorHAnsi" w:hAnsiTheme="minorHAnsi" w:cstheme="minorHAnsi"/>
+                          <w:color w:val="000000" w:themeColor="text1"/>
+                          <w:sz w:val="20"/>
+                          <w:szCs w:val="20"/>
+                          <w:lang w:val="en-US"/>
+                        </w:rPr>
+                        <w:t xml:space="preserve">: digital drill-core and mine-workings documentation.</w:t>
+                      </w:r>
+                    </w:p>
+                    <w:p>
+                      <w:pPr>
+                        <w:pStyle w:val="15"/>
+                        <w:spacing w:before="0" w:line="240" w:lineRule="auto" w:after="100"/>
+                        <w:rPr>
+                          <w:rFonts w:asciiTheme="minorHAnsi" w:hAnsiTheme="minorHAnsi" w:cstheme="minorHAnsi"/>
+                          <w:color w:val="000000" w:themeColor="text1"/>
+                          <w:sz w:val="20"/>
+                          <w:szCs w:val="20"/>
+                          <w:lang w:val="en-US"/>
+                        </w:rPr>
+                      </w:pPr>
+                      <w:r>
+                        <w:rPr>
+                          <w:rFonts w:asciiTheme="minorHAnsi" w:hAnsiTheme="minorHAnsi" w:cstheme="minorHAnsi"/>
+                          <w:color w:val="000000" w:themeColor="text1"/>
+                          <w:sz w:val="20"/>
+                          <w:szCs w:val="20"/>
+                          <w:lang w:val="en-US"/>
+                          <w:b/>
+                        </w:rPr>
+                        <w:t xml:space="preserve">RockSurv Petrography</w:t>
+                      </w:r>
+                      <w:r>
+                        <w:rPr>
+                          <w:rFonts w:asciiTheme="minorHAnsi" w:hAnsiTheme="minorHAnsi" w:cstheme="minorHAnsi"/>
+                          <w:color w:val="000000" w:themeColor="text1"/>
+                          <w:sz w:val="20"/>
+                          <w:szCs w:val="20"/>
+                          <w:lang w:val="en-US"/>
+                        </w:rPr>
+                        <w:t xml:space="preserve">: microscopic mineral identification and a thin-section atlas.</w:t>
+                      </w:r>
+                    </w:p>
+                    <w:p>
+                      <w:pPr>
+                        <w:pStyle w:val="15"/>
+                        <w:spacing w:before="0" w:line="240" w:lineRule="auto" w:after="100"/>
+                        <w:rPr>
+                          <w:rFonts w:asciiTheme="minorHAnsi" w:hAnsiTheme="minorHAnsi" w:cstheme="minorHAnsi"/>
+                          <w:color w:val="000000" w:themeColor="text1"/>
+                          <w:sz w:val="20"/>
+                          <w:szCs w:val="20"/>
+                          <w:lang w:val="en-US"/>
+                        </w:rPr>
+                      </w:pPr>
+                      <w:r>
+                        <w:rPr>
+                          <w:rFonts w:asciiTheme="minorHAnsi" w:hAnsiTheme="minorHAnsi" w:cstheme="minorHAnsi"/>
+                          <w:color w:val="000000" w:themeColor="text1"/>
+                          <w:sz w:val="20"/>
+                          <w:szCs w:val="20"/>
+                          <w:lang w:val="en-US"/>
+                        </w:rPr>
+                        <w:t xml:space="preserve">Prototypes in development. Workflows and demonstrations are available online.</w:t>
+                      </w:r>
+                    </w:p>
                     <w:p>
                       <w:pPr>
                         <w:pStyle w:val="15"/>
@@ -3073,357 +2936,6 @@
                         </w:rPr>
                         <w:t xml:space="preserve"> Russian (Native), English (Upper-Intermediate), Chinese (HSK 3, Pre-Intermediate).</w:t>
                       </w:r>
-                    </w:p>
-                    <w:p>
-                      <w:pPr>
-                        <w:pStyle w:val="15"/>
-                        <w:spacing w:before="240" w:after="240" w:line="240" w:lineRule="auto"/>
-                        <w:rPr>
-                          <w:rFonts w:asciiTheme="minorHAnsi" w:hAnsiTheme="minorHAnsi" w:cstheme="minorHAnsi"/>
-                          <w:b/>
-                          <w:bCs/>
-                          <w:color w:val="000000" w:themeColor="text1"/>
-                          <w:sz w:val="28"/>
-                          <w:lang w:val="en-US"/>
-                        </w:rPr>
-                      </w:pPr>
-                      <w:r>
-                        <w:rPr>
-                          <w:rFonts w:asciiTheme="minorHAnsi" w:hAnsiTheme="minorHAnsi" w:cstheme="minorHAnsi"/>
-                          <w:b/>
-                          <w:bCs/>
-                          <w:color w:val="000000" w:themeColor="text1"/>
-                          <w:sz w:val="28"/>
-                          <w:lang w:val="en-US"/>
-                        </w:rPr>
-                        <w:t>Education</w:t>
-                      </w:r>
-                    </w:p>
-                    <w:p>
-                      <w:pPr>
-                        <w:pStyle w:val="15"/>
-                        <w:spacing w:line="240" w:lineRule="auto"/>
-                        <w:rPr>
-                          <w:rFonts w:asciiTheme="minorHAnsi" w:hAnsiTheme="minorHAnsi" w:cstheme="minorHAnsi"/>
-                          <w:b/>
-                          <w:bCs/>
-                          <w:color w:val="000000" w:themeColor="text1"/>
-                          <w:sz w:val="20"/>
-                          <w:szCs w:val="20"/>
-                          <w:lang w:val="en-US"/>
-                        </w:rPr>
-                      </w:pPr>
-                      <w:r>
-                        <w:rPr>
-                          <w:rFonts w:asciiTheme="minorHAnsi" w:hAnsiTheme="minorHAnsi" w:cstheme="minorHAnsi"/>
-                          <w:b/>
-                          <w:bCs/>
-                          <w:color w:val="000000" w:themeColor="text1"/>
-                          <w:sz w:val="20"/>
-                          <w:szCs w:val="20"/>
-                          <w:lang w:val="en-US"/>
-                        </w:rPr>
-                        <w:t>2023, Yandex academy</w:t>
-                      </w:r>
-                    </w:p>
-                    <w:p>
-                      <w:pPr>
-                        <w:pStyle w:val="15"/>
-                        <w:spacing w:line="240" w:lineRule="auto"/>
-                        <w:rPr>
-                          <w:rFonts w:asciiTheme="minorHAnsi" w:hAnsiTheme="minorHAnsi" w:cstheme="minorHAnsi"/>
-                          <w:b/>
-                          <w:bCs/>
-                          <w:color w:val="000000" w:themeColor="text1"/>
-                          <w:sz w:val="20"/>
-                          <w:szCs w:val="20"/>
-                          <w:lang w:val="en-US"/>
-                        </w:rPr>
-                      </w:pPr>
-                      <w:r>
-                        <w:rPr>
-                          <w:rFonts w:asciiTheme="minorHAnsi" w:hAnsiTheme="minorHAnsi" w:cstheme="minorHAnsi"/>
-                          <w:b/>
-                          <w:bCs/>
-                          <w:color w:val="000000" w:themeColor="text1"/>
-                          <w:sz w:val="20"/>
-                          <w:szCs w:val="20"/>
-                          <w:lang w:val="en-US"/>
-                        </w:rPr>
-                        <w:t>QAQC engineer</w:t>
-                      </w:r>
-                    </w:p>
-                    <w:p>
-                      <w:pPr>
-                        <w:pStyle w:val="15"/>
-                        <w:spacing w:line="240" w:lineRule="auto"/>
-                        <w:rPr>
-                          <w:rFonts w:asciiTheme="minorHAnsi" w:hAnsiTheme="minorHAnsi" w:cstheme="minorHAnsi"/>
-                          <w:color w:val="000000" w:themeColor="text1"/>
-                          <w:sz w:val="20"/>
-                          <w:szCs w:val="20"/>
-                          <w:lang w:val="en-US"/>
-                        </w:rPr>
-                      </w:pPr>
-                      <w:r>
-                        <w:rPr>
-                          <w:rFonts w:asciiTheme="minorHAnsi" w:hAnsiTheme="minorHAnsi" w:cstheme="minorHAnsi"/>
-                          <w:color w:val="000000" w:themeColor="text1"/>
-                          <w:sz w:val="20"/>
-                          <w:szCs w:val="20"/>
-                          <w:lang w:val="en-US"/>
-                        </w:rPr>
-                        <w:t>Specialization: Web/mobile application testing, API testing, SQL, test automation fundamentals</w:t>
-                      </w:r>
-                    </w:p>
-                    <w:p>
-                      <w:pPr>
-                        <w:pStyle w:val="15"/>
-                        <w:spacing w:line="240" w:lineRule="auto"/>
-                        <w:rPr>
-                          <w:rFonts w:asciiTheme="minorHAnsi" w:hAnsiTheme="minorHAnsi" w:cstheme="minorHAnsi"/>
-                          <w:b/>
-                          <w:bCs/>
-                          <w:color w:val="000000" w:themeColor="text1"/>
-                          <w:sz w:val="20"/>
-                          <w:szCs w:val="20"/>
-                          <w:lang w:val="en-US"/>
-                        </w:rPr>
-                      </w:pPr>
-                    </w:p>
-                    <w:p>
-                      <w:pPr>
-                        <w:pStyle w:val="15"/>
-                        <w:spacing w:line="240" w:lineRule="auto"/>
-                        <w:rPr>
-                          <w:rFonts w:asciiTheme="minorHAnsi" w:hAnsiTheme="minorHAnsi" w:cstheme="minorHAnsi"/>
-                          <w:b/>
-                          <w:bCs/>
-                          <w:color w:val="000000" w:themeColor="text1"/>
-                          <w:sz w:val="20"/>
-                          <w:szCs w:val="20"/>
-                          <w:lang w:val="en-US"/>
-                        </w:rPr>
-                      </w:pPr>
-                      <w:r>
-                        <w:rPr>
-                          <w:rFonts w:asciiTheme="minorHAnsi" w:hAnsiTheme="minorHAnsi" w:cstheme="minorHAnsi"/>
-                          <w:b/>
-                          <w:bCs/>
-                          <w:color w:val="000000" w:themeColor="text1"/>
-                          <w:sz w:val="20"/>
-                          <w:szCs w:val="20"/>
-                          <w:lang w:val="en-US"/>
-                        </w:rPr>
-                        <w:t>2010-2014, Saint Petersburg</w:t>
-                      </w:r>
-                    </w:p>
-                    <w:p>
-                      <w:pPr>
-                        <w:pStyle w:val="15"/>
-                        <w:spacing w:line="240" w:lineRule="auto"/>
-                        <w:rPr>
-                          <w:rFonts w:asciiTheme="minorHAnsi" w:hAnsiTheme="minorHAnsi" w:cstheme="minorHAnsi"/>
-                          <w:b/>
-                          <w:bCs/>
-                          <w:color w:val="000000" w:themeColor="text1"/>
-                          <w:sz w:val="20"/>
-                          <w:szCs w:val="20"/>
-                          <w:lang w:val="en-US"/>
-                        </w:rPr>
-                      </w:pPr>
-                      <w:r>
-                        <w:rPr>
-                          <w:rFonts w:asciiTheme="minorHAnsi" w:hAnsiTheme="minorHAnsi" w:cstheme="minorHAnsi"/>
-                          <w:b/>
-                          <w:bCs/>
-                          <w:color w:val="000000" w:themeColor="text1"/>
-                          <w:sz w:val="20"/>
-                          <w:szCs w:val="20"/>
-                          <w:lang w:val="en-US"/>
-                        </w:rPr>
-                        <w:t xml:space="preserve">Postgraduate education </w:t>
-                      </w:r>
-                    </w:p>
-                    <w:p>
-                      <w:pPr>
-                        <w:pStyle w:val="15"/>
-                        <w:spacing w:line="240" w:lineRule="auto"/>
-                        <w:rPr>
-                          <w:rFonts w:asciiTheme="minorHAnsi" w:hAnsiTheme="minorHAnsi" w:cstheme="minorHAnsi"/>
-                          <w:color w:val="000000" w:themeColor="text1"/>
-                          <w:sz w:val="20"/>
-                          <w:szCs w:val="20"/>
-                          <w:lang w:val="en-US"/>
-                        </w:rPr>
-                      </w:pPr>
-                      <w:r>
-                        <w:rPr>
-                          <w:rFonts w:asciiTheme="minorHAnsi" w:hAnsiTheme="minorHAnsi" w:cstheme="minorHAnsi"/>
-                          <w:color w:val="000000" w:themeColor="text1"/>
-                          <w:sz w:val="20"/>
-                          <w:szCs w:val="20"/>
-                          <w:lang w:val="en-US"/>
-                        </w:rPr>
-                        <w:t>Karpinsky Russian Geological Research Institute (Karpinsky Institute, VSEGEI)</w:t>
-                      </w:r>
-                    </w:p>
-                    <w:p>
-                      <w:pPr>
-                        <w:pStyle w:val="15"/>
-                        <w:spacing w:line="240" w:lineRule="auto"/>
-                        <w:rPr>
-                          <w:rFonts w:asciiTheme="minorHAnsi" w:hAnsiTheme="minorHAnsi" w:cstheme="minorHAnsi"/>
-                          <w:color w:val="000000" w:themeColor="text1"/>
-                          <w:sz w:val="20"/>
-                          <w:szCs w:val="20"/>
-                          <w:lang w:val="en-US"/>
-                        </w:rPr>
-                      </w:pPr>
-                      <w:r>
-                        <w:rPr>
-                          <w:rFonts w:asciiTheme="minorHAnsi" w:hAnsiTheme="minorHAnsi" w:cstheme="minorHAnsi"/>
-                          <w:color w:val="000000" w:themeColor="text1"/>
-                          <w:sz w:val="20"/>
-                          <w:szCs w:val="20"/>
-                          <w:lang w:val="en-US"/>
-                        </w:rPr>
-                        <w:t>Specialization: Geology, Geological survey and Minerageny</w:t>
-                      </w:r>
-                    </w:p>
-                    <w:p>
-                      <w:pPr>
-                        <w:pStyle w:val="15"/>
-                        <w:spacing w:line="240" w:lineRule="auto"/>
-                        <w:rPr>
-                          <w:rFonts w:asciiTheme="minorHAnsi" w:hAnsiTheme="minorHAnsi" w:cstheme="minorHAnsi"/>
-                          <w:color w:val="000000" w:themeColor="text1"/>
-                          <w:sz w:val="20"/>
-                          <w:szCs w:val="20"/>
-                          <w:lang w:val="en-US"/>
-                        </w:rPr>
-                      </w:pPr>
-                    </w:p>
-                    <w:p>
-                      <w:pPr>
-                        <w:pStyle w:val="15"/>
-                        <w:spacing w:line="240" w:lineRule="auto"/>
-                        <w:rPr>
-                          <w:rFonts w:asciiTheme="minorHAnsi" w:hAnsiTheme="minorHAnsi" w:cstheme="minorHAnsi"/>
-                          <w:b/>
-                          <w:bCs/>
-                          <w:color w:val="000000" w:themeColor="text1"/>
-                          <w:sz w:val="20"/>
-                          <w:szCs w:val="20"/>
-                          <w:lang w:val="en-US"/>
-                        </w:rPr>
-                      </w:pPr>
-                      <w:r>
-                        <w:rPr>
-                          <w:rFonts w:asciiTheme="minorHAnsi" w:hAnsiTheme="minorHAnsi" w:cstheme="minorHAnsi"/>
-                          <w:b/>
-                          <w:bCs/>
-                          <w:color w:val="000000" w:themeColor="text1"/>
-                          <w:sz w:val="20"/>
-                          <w:szCs w:val="20"/>
-                          <w:lang w:val="en-US"/>
-                        </w:rPr>
-                        <w:t>2005 – 2010, Saint Petersburg</w:t>
-                      </w:r>
-                    </w:p>
-                    <w:p>
-                      <w:pPr>
-                        <w:pStyle w:val="15"/>
-                        <w:spacing w:line="240" w:lineRule="auto"/>
-                        <w:rPr>
-                          <w:rFonts w:asciiTheme="minorHAnsi" w:hAnsiTheme="minorHAnsi" w:cstheme="minorHAnsi"/>
-                          <w:b/>
-                          <w:bCs/>
-                          <w:color w:val="000000" w:themeColor="text1"/>
-                          <w:sz w:val="20"/>
-                          <w:szCs w:val="20"/>
-                          <w:lang w:val="en-US"/>
-                        </w:rPr>
-                      </w:pPr>
-                      <w:r>
-                        <w:rPr>
-                          <w:rFonts w:asciiTheme="minorHAnsi" w:hAnsiTheme="minorHAnsi" w:cstheme="minorHAnsi"/>
-                          <w:b/>
-                          <w:bCs/>
-                          <w:color w:val="000000" w:themeColor="text1"/>
-                          <w:sz w:val="20"/>
-                          <w:szCs w:val="20"/>
-                          <w:lang w:val="en-US"/>
-                        </w:rPr>
-                        <w:t>Mining engineer</w:t>
-                      </w:r>
-                    </w:p>
-                    <w:p>
-                      <w:pPr>
-                        <w:pStyle w:val="15"/>
-                        <w:spacing w:line="240" w:lineRule="auto"/>
-                        <w:rPr>
-                          <w:rFonts w:asciiTheme="minorHAnsi" w:hAnsiTheme="minorHAnsi" w:cstheme="minorHAnsi"/>
-                          <w:color w:val="000000" w:themeColor="text1"/>
-                          <w:sz w:val="20"/>
-                          <w:szCs w:val="20"/>
-                          <w:lang w:val="en-US"/>
-                        </w:rPr>
-                      </w:pPr>
-                      <w:r>
-                        <w:rPr>
-                          <w:rFonts w:asciiTheme="minorHAnsi" w:hAnsiTheme="minorHAnsi" w:cstheme="minorHAnsi"/>
-                          <w:color w:val="000000" w:themeColor="text1"/>
-                          <w:sz w:val="20"/>
-                          <w:szCs w:val="20"/>
-                          <w:lang w:val="en-US"/>
-                        </w:rPr>
-                        <w:t xml:space="preserve">Saint Petersburg Mining University </w:t>
-                      </w:r>
-                    </w:p>
-                    <w:p>
-                      <w:pPr>
-                        <w:pStyle w:val="15"/>
-                        <w:spacing w:line="240" w:lineRule="auto"/>
-                        <w:rPr>
-                          <w:rFonts w:asciiTheme="minorHAnsi" w:hAnsiTheme="minorHAnsi" w:cstheme="minorHAnsi"/>
-                          <w:color w:val="000000" w:themeColor="text1"/>
-                          <w:sz w:val="20"/>
-                          <w:szCs w:val="20"/>
-                          <w:lang w:val="en-US"/>
-                        </w:rPr>
-                      </w:pPr>
-                      <w:r>
-                        <w:rPr>
-                          <w:rFonts w:asciiTheme="minorHAnsi" w:hAnsiTheme="minorHAnsi" w:cstheme="minorHAnsi"/>
-                          <w:color w:val="000000" w:themeColor="text1"/>
-                          <w:sz w:val="20"/>
-                          <w:szCs w:val="20"/>
-                          <w:lang w:val="en-US"/>
-                        </w:rPr>
-                        <w:t xml:space="preserve">Specialization: Mineralogy, petrography and applied geochemistry </w:t>
-                      </w:r>
-                    </w:p>
-                    <w:p>
-                      <w:pPr>
-                        <w:pStyle w:val="15"/>
-                        <w:spacing w:line="240" w:lineRule="auto"/>
-                        <w:rPr>
-                          <w:rFonts w:asciiTheme="minorHAnsi" w:hAnsiTheme="minorHAnsi" w:cstheme="minorHAnsi"/>
-                          <w:color w:val="000000" w:themeColor="text1"/>
-                          <w:sz w:val="28"/>
-                          <w:lang w:val="en-US"/>
-                        </w:rPr>
-                      </w:pPr>
-                    </w:p>
-                    <w:p>
-                      <w:pPr>
-                        <w:rPr>
-                          <w:rFonts w:asciiTheme="minorHAnsi" w:hAnsiTheme="minorHAnsi" w:cstheme="minorHAnsi"/>
-                          <w:color w:val="000000" w:themeColor="text1"/>
-                          <w:lang w:val="en-US"/>
-                        </w:rPr>
-                      </w:pPr>
                     </w:p>
                   </w:txbxContent>
                 </v:textbox>
@@ -5519,21 +5031,304 @@
                           <w:p>
                             <w:pPr>
                               <w:pStyle w:val="15"/>
-                              <w:spacing w:line="240" w:lineRule="auto"/>
+                              <w:spacing w:before="240" w:after="240" w:line="240" w:lineRule="auto"/>
                               <w:rPr>
-                                <w:rFonts w:ascii="Verdana" w:hAnsi="Verdana"/>
+                                <w:rFonts w:asciiTheme="minorHAnsi" w:hAnsiTheme="minorHAnsi" w:cstheme="minorHAnsi"/>
+                                <w:b/>
+                                <w:bCs/>
+                                <w:color w:val="000000" w:themeColor="text1"/>
                                 <w:sz w:val="28"/>
                                 <w:lang w:val="en-US"/>
                               </w:rPr>
                             </w:pPr>
+                            <w:r>
+                              <w:rPr>
+                                <w:rFonts w:asciiTheme="minorHAnsi" w:hAnsiTheme="minorHAnsi" w:cstheme="minorHAnsi"/>
+                                <w:b/>
+                                <w:bCs/>
+                                <w:color w:val="000000" w:themeColor="text1"/>
+                                <w:sz w:val="28"/>
+                                <w:lang w:val="en-US"/>
+                              </w:rPr>
+                              <w:t>Education</w:t>
+                            </w:r>
                           </w:p>
                           <w:p>
                             <w:pPr>
+                              <w:pStyle w:val="15"/>
+                              <w:spacing w:line="240" w:lineRule="auto"/>
                               <w:rPr>
-                                <w:rFonts w:ascii="Verdana" w:hAnsi="Verdana"/>
+                                <w:rFonts w:asciiTheme="minorHAnsi" w:hAnsiTheme="minorHAnsi" w:cstheme="minorHAnsi"/>
+                                <w:b/>
+                                <w:bCs/>
+                                <w:color w:val="000000" w:themeColor="text1"/>
+                                <w:sz w:val="20"/>
+                                <w:szCs w:val="20"/>
                                 <w:lang w:val="en-US"/>
                               </w:rPr>
                             </w:pPr>
+                            <w:r>
+                              <w:rPr>
+                                <w:rFonts w:asciiTheme="minorHAnsi" w:hAnsiTheme="minorHAnsi" w:cstheme="minorHAnsi"/>
+                                <w:b/>
+                                <w:bCs/>
+                                <w:color w:val="000000" w:themeColor="text1"/>
+                                <w:sz w:val="20"/>
+                                <w:szCs w:val="20"/>
+                                <w:lang w:val="en-US"/>
+                              </w:rPr>
+                              <w:t>2023, Yandex academy</w:t>
+                            </w:r>
+                          </w:p>
+                          <w:p>
+                            <w:pPr>
+                              <w:pStyle w:val="15"/>
+                              <w:spacing w:line="240" w:lineRule="auto"/>
+                              <w:rPr>
+                                <w:rFonts w:asciiTheme="minorHAnsi" w:hAnsiTheme="minorHAnsi" w:cstheme="minorHAnsi"/>
+                                <w:b/>
+                                <w:bCs/>
+                                <w:color w:val="000000" w:themeColor="text1"/>
+                                <w:sz w:val="20"/>
+                                <w:szCs w:val="20"/>
+                                <w:lang w:val="en-US"/>
+                              </w:rPr>
+                            </w:pPr>
+                            <w:r>
+                              <w:rPr>
+                                <w:rFonts w:asciiTheme="minorHAnsi" w:hAnsiTheme="minorHAnsi" w:cstheme="minorHAnsi"/>
+                                <w:b/>
+                                <w:bCs/>
+                                <w:color w:val="000000" w:themeColor="text1"/>
+                                <w:sz w:val="20"/>
+                                <w:szCs w:val="20"/>
+                                <w:lang w:val="en-US"/>
+                              </w:rPr>
+                              <w:t>QAQC engineer</w:t>
+                            </w:r>
+                          </w:p>
+                          <w:p>
+                            <w:pPr>
+                              <w:pStyle w:val="15"/>
+                              <w:spacing w:line="240" w:lineRule="auto"/>
+                              <w:rPr>
+                                <w:rFonts w:asciiTheme="minorHAnsi" w:hAnsiTheme="minorHAnsi" w:cstheme="minorHAnsi"/>
+                                <w:color w:val="000000" w:themeColor="text1"/>
+                                <w:sz w:val="20"/>
+                                <w:szCs w:val="20"/>
+                                <w:lang w:val="en-US"/>
+                              </w:rPr>
+                            </w:pPr>
+                            <w:r>
+                              <w:rPr>
+                                <w:rFonts w:asciiTheme="minorHAnsi" w:hAnsiTheme="minorHAnsi" w:cstheme="minorHAnsi"/>
+                                <w:color w:val="000000" w:themeColor="text1"/>
+                                <w:sz w:val="20"/>
+                                <w:szCs w:val="20"/>
+                                <w:lang w:val="en-US"/>
+                              </w:rPr>
+                              <w:t>Specialization: Web/mobile application testing, API testing, SQL, test automation fundamentals</w:t>
+                            </w:r>
+                          </w:p>
+                          <w:p>
+                            <w:pPr>
+                              <w:pStyle w:val="15"/>
+                              <w:spacing w:line="240" w:lineRule="auto"/>
+                              <w:rPr>
+                                <w:rFonts w:asciiTheme="minorHAnsi" w:hAnsiTheme="minorHAnsi" w:cstheme="minorHAnsi"/>
+                                <w:b/>
+                                <w:bCs/>
+                                <w:color w:val="000000" w:themeColor="text1"/>
+                                <w:sz w:val="20"/>
+                                <w:szCs w:val="20"/>
+                                <w:lang w:val="en-US"/>
+                              </w:rPr>
+                            </w:pPr>
+                            <w:r>
+                              <w:rPr>
+                                <w:rFonts w:asciiTheme="minorHAnsi" w:hAnsiTheme="minorHAnsi" w:cstheme="minorHAnsi"/>
+                                <w:b/>
+                                <w:bCs/>
+                                <w:color w:val="000000" w:themeColor="text1"/>
+                                <w:sz w:val="20"/>
+                                <w:szCs w:val="20"/>
+                                <w:lang w:val="en-US"/>
+                              </w:rPr>
+                              <w:t>2010-2014, Saint Petersburg</w:t>
+                            </w:r>
+                          </w:p>
+                          <w:p>
+                            <w:pPr>
+                              <w:pStyle w:val="15"/>
+                              <w:spacing w:line="240" w:lineRule="auto"/>
+                              <w:rPr>
+                                <w:rFonts w:asciiTheme="minorHAnsi" w:hAnsiTheme="minorHAnsi" w:cstheme="minorHAnsi"/>
+                                <w:b/>
+                                <w:bCs/>
+                                <w:color w:val="000000" w:themeColor="text1"/>
+                                <w:sz w:val="20"/>
+                                <w:szCs w:val="20"/>
+                                <w:lang w:val="en-US"/>
+                              </w:rPr>
+                            </w:pPr>
+                            <w:r>
+                              <w:rPr>
+                                <w:rFonts w:asciiTheme="minorHAnsi" w:hAnsiTheme="minorHAnsi" w:cstheme="minorHAnsi"/>
+                                <w:b/>
+                                <w:bCs/>
+                                <w:color w:val="000000" w:themeColor="text1"/>
+                                <w:sz w:val="20"/>
+                                <w:szCs w:val="20"/>
+                                <w:lang w:val="en-US"/>
+                              </w:rPr>
+                              <w:t xml:space="preserve">Postgraduate education </w:t>
+                            </w:r>
+                          </w:p>
+                          <w:p>
+                            <w:pPr>
+                              <w:pStyle w:val="15"/>
+                              <w:spacing w:line="240" w:lineRule="auto"/>
+                              <w:rPr>
+                                <w:rFonts w:asciiTheme="minorHAnsi" w:hAnsiTheme="minorHAnsi" w:cstheme="minorHAnsi"/>
+                                <w:color w:val="000000" w:themeColor="text1"/>
+                                <w:sz w:val="20"/>
+                                <w:szCs w:val="20"/>
+                                <w:lang w:val="en-US"/>
+                              </w:rPr>
+                            </w:pPr>
+                            <w:r>
+                              <w:rPr>
+                                <w:rFonts w:asciiTheme="minorHAnsi" w:hAnsiTheme="minorHAnsi" w:cstheme="minorHAnsi"/>
+                                <w:color w:val="000000" w:themeColor="text1"/>
+                                <w:sz w:val="20"/>
+                                <w:szCs w:val="20"/>
+                                <w:lang w:val="en-US"/>
+                              </w:rPr>
+                              <w:t>Karpinsky Russian Geological Research Institute (Karpinsky Institute, VSEGEI)</w:t>
+                            </w:r>
+                          </w:p>
+                          <w:p>
+                            <w:pPr>
+                              <w:pStyle w:val="15"/>
+                              <w:spacing w:line="240" w:lineRule="auto"/>
+                              <w:rPr>
+                                <w:rFonts w:asciiTheme="minorHAnsi" w:hAnsiTheme="minorHAnsi" w:cstheme="minorHAnsi"/>
+                                <w:color w:val="000000" w:themeColor="text1"/>
+                                <w:sz w:val="20"/>
+                                <w:szCs w:val="20"/>
+                                <w:lang w:val="en-US"/>
+                              </w:rPr>
+                            </w:pPr>
+                            <w:r>
+                              <w:rPr>
+                                <w:rFonts w:asciiTheme="minorHAnsi" w:hAnsiTheme="minorHAnsi" w:cstheme="minorHAnsi"/>
+                                <w:color w:val="000000" w:themeColor="text1"/>
+                                <w:sz w:val="20"/>
+                                <w:szCs w:val="20"/>
+                                <w:lang w:val="en-US"/>
+                              </w:rPr>
+                              <w:t>Specialization: Geology, Geological survey and Minerageny</w:t>
+                            </w:r>
+                          </w:p>
+                          <w:p>
+                            <w:pPr>
+                              <w:pStyle w:val="15"/>
+                              <w:spacing w:line="240" w:lineRule="auto"/>
+                              <w:rPr>
+                                <w:rFonts w:asciiTheme="minorHAnsi" w:hAnsiTheme="minorHAnsi" w:cstheme="minorHAnsi"/>
+                                <w:b/>
+                                <w:bCs/>
+                                <w:color w:val="000000" w:themeColor="text1"/>
+                                <w:sz w:val="20"/>
+                                <w:szCs w:val="20"/>
+                                <w:lang w:val="en-US"/>
+                              </w:rPr>
+                            </w:pPr>
+                            <w:r>
+                              <w:rPr>
+                                <w:rFonts w:asciiTheme="minorHAnsi" w:hAnsiTheme="minorHAnsi" w:cstheme="minorHAnsi"/>
+                                <w:b/>
+                                <w:bCs/>
+                                <w:color w:val="000000" w:themeColor="text1"/>
+                                <w:sz w:val="20"/>
+                                <w:szCs w:val="20"/>
+                                <w:lang w:val="en-US"/>
+                              </w:rPr>
+                              <w:t>2005 – 2010, Saint Petersburg</w:t>
+                            </w:r>
+                          </w:p>
+                          <w:p>
+                            <w:pPr>
+                              <w:pStyle w:val="15"/>
+                              <w:spacing w:line="240" w:lineRule="auto"/>
+                              <w:rPr>
+                                <w:rFonts w:asciiTheme="minorHAnsi" w:hAnsiTheme="minorHAnsi" w:cstheme="minorHAnsi"/>
+                                <w:b/>
+                                <w:bCs/>
+                                <w:color w:val="000000" w:themeColor="text1"/>
+                                <w:sz w:val="20"/>
+                                <w:szCs w:val="20"/>
+                                <w:lang w:val="en-US"/>
+                              </w:rPr>
+                            </w:pPr>
+                            <w:r>
+                              <w:rPr>
+                                <w:rFonts w:asciiTheme="minorHAnsi" w:hAnsiTheme="minorHAnsi" w:cstheme="minorHAnsi"/>
+                                <w:b/>
+                                <w:bCs/>
+                                <w:color w:val="000000" w:themeColor="text1"/>
+                                <w:sz w:val="20"/>
+                                <w:szCs w:val="20"/>
+                                <w:lang w:val="en-US"/>
+                              </w:rPr>
+                              <w:t>Mining engineer</w:t>
+                            </w:r>
+                          </w:p>
+                          <w:p>
+                            <w:pPr>
+                              <w:pStyle w:val="15"/>
+                              <w:spacing w:line="240" w:lineRule="auto"/>
+                              <w:rPr>
+                                <w:rFonts w:asciiTheme="minorHAnsi" w:hAnsiTheme="minorHAnsi" w:cstheme="minorHAnsi"/>
+                                <w:color w:val="000000" w:themeColor="text1"/>
+                                <w:sz w:val="20"/>
+                                <w:szCs w:val="20"/>
+                                <w:lang w:val="en-US"/>
+                              </w:rPr>
+                            </w:pPr>
+                            <w:r>
+                              <w:rPr>
+                                <w:rFonts w:asciiTheme="minorHAnsi" w:hAnsiTheme="minorHAnsi" w:cstheme="minorHAnsi"/>
+                                <w:color w:val="000000" w:themeColor="text1"/>
+                                <w:sz w:val="20"/>
+                                <w:szCs w:val="20"/>
+                                <w:lang w:val="en-US"/>
+                              </w:rPr>
+                              <w:t xml:space="preserve">Saint Petersburg Mining University </w:t>
+                            </w:r>
+                          </w:p>
+                          <w:p>
+                            <w:pPr>
+                              <w:pStyle w:val="15"/>
+                              <w:spacing w:line="240" w:lineRule="auto"/>
+                              <w:rPr>
+                                <w:rFonts w:asciiTheme="minorHAnsi" w:hAnsiTheme="minorHAnsi" w:cstheme="minorHAnsi"/>
+                                <w:color w:val="000000" w:themeColor="text1"/>
+                                <w:sz w:val="20"/>
+                                <w:szCs w:val="20"/>
+                                <w:lang w:val="en-US"/>
+                              </w:rPr>
+                            </w:pPr>
+                            <w:r>
+                              <w:rPr>
+                                <w:rFonts w:asciiTheme="minorHAnsi" w:hAnsiTheme="minorHAnsi" w:cstheme="minorHAnsi"/>
+                                <w:color w:val="000000" w:themeColor="text1"/>
+                                <w:sz w:val="20"/>
+                                <w:szCs w:val="20"/>
+                                <w:lang w:val="en-US"/>
+                              </w:rPr>
+                              <w:t xml:space="preserve">Specialization: Mineralogy, petrography and applied geochemistry </w:t>
+                            </w:r>
                           </w:p>
                         </w:txbxContent>
                       </wps:txbx>
@@ -5864,21 +5659,304 @@
                     <w:p>
                       <w:pPr>
                         <w:pStyle w:val="15"/>
-                        <w:spacing w:line="240" w:lineRule="auto"/>
+                        <w:spacing w:before="240" w:after="240" w:line="240" w:lineRule="auto"/>
                         <w:rPr>
-                          <w:rFonts w:ascii="Verdana" w:hAnsi="Verdana"/>
+                          <w:rFonts w:asciiTheme="minorHAnsi" w:hAnsiTheme="minorHAnsi" w:cstheme="minorHAnsi"/>
+                          <w:b/>
+                          <w:bCs/>
+                          <w:color w:val="000000" w:themeColor="text1"/>
                           <w:sz w:val="28"/>
                           <w:lang w:val="en-US"/>
                         </w:rPr>
                       </w:pPr>
+                      <w:r>
+                        <w:rPr>
+                          <w:rFonts w:asciiTheme="minorHAnsi" w:hAnsiTheme="minorHAnsi" w:cstheme="minorHAnsi"/>
+                          <w:b/>
+                          <w:bCs/>
+                          <w:color w:val="000000" w:themeColor="text1"/>
+                          <w:sz w:val="28"/>
+                          <w:lang w:val="en-US"/>
+                        </w:rPr>
+                        <w:t>Education</w:t>
+                      </w:r>
                     </w:p>
                     <w:p>
                       <w:pPr>
+                        <w:pStyle w:val="15"/>
+                        <w:spacing w:line="240" w:lineRule="auto"/>
                         <w:rPr>
-                          <w:rFonts w:ascii="Verdana" w:hAnsi="Verdana"/>
+                          <w:rFonts w:asciiTheme="minorHAnsi" w:hAnsiTheme="minorHAnsi" w:cstheme="minorHAnsi"/>
+                          <w:b/>
+                          <w:bCs/>
+                          <w:color w:val="000000" w:themeColor="text1"/>
+                          <w:sz w:val="20"/>
+                          <w:szCs w:val="20"/>
                           <w:lang w:val="en-US"/>
                         </w:rPr>
                       </w:pPr>
+                      <w:r>
+                        <w:rPr>
+                          <w:rFonts w:asciiTheme="minorHAnsi" w:hAnsiTheme="minorHAnsi" w:cstheme="minorHAnsi"/>
+                          <w:b/>
+                          <w:bCs/>
+                          <w:color w:val="000000" w:themeColor="text1"/>
+                          <w:sz w:val="20"/>
+                          <w:szCs w:val="20"/>
+                          <w:lang w:val="en-US"/>
+                        </w:rPr>
+                        <w:t>2023, Yandex academy</w:t>
+                      </w:r>
+                    </w:p>
+                    <w:p>
+                      <w:pPr>
+                        <w:pStyle w:val="15"/>
+                        <w:spacing w:line="240" w:lineRule="auto"/>
+                        <w:rPr>
+                          <w:rFonts w:asciiTheme="minorHAnsi" w:hAnsiTheme="minorHAnsi" w:cstheme="minorHAnsi"/>
+                          <w:b/>
+                          <w:bCs/>
+                          <w:color w:val="000000" w:themeColor="text1"/>
+                          <w:sz w:val="20"/>
+                          <w:szCs w:val="20"/>
+                          <w:lang w:val="en-US"/>
+                        </w:rPr>
+                      </w:pPr>
+                      <w:r>
+                        <w:rPr>
+                          <w:rFonts w:asciiTheme="minorHAnsi" w:hAnsiTheme="minorHAnsi" w:cstheme="minorHAnsi"/>
+                          <w:b/>
+                          <w:bCs/>
+                          <w:color w:val="000000" w:themeColor="text1"/>
+                          <w:sz w:val="20"/>
+                          <w:szCs w:val="20"/>
+                          <w:lang w:val="en-US"/>
+                        </w:rPr>
+                        <w:t>QAQC engineer</w:t>
+                      </w:r>
+                    </w:p>
+                    <w:p>
+                      <w:pPr>
+                        <w:pStyle w:val="15"/>
+                        <w:spacing w:line="240" w:lineRule="auto"/>
+                        <w:rPr>
+                          <w:rFonts w:asciiTheme="minorHAnsi" w:hAnsiTheme="minorHAnsi" w:cstheme="minorHAnsi"/>
+                          <w:color w:val="000000" w:themeColor="text1"/>
+                          <w:sz w:val="20"/>
+                          <w:szCs w:val="20"/>
+                          <w:lang w:val="en-US"/>
+                        </w:rPr>
+                      </w:pPr>
+                      <w:r>
+                        <w:rPr>
+                          <w:rFonts w:asciiTheme="minorHAnsi" w:hAnsiTheme="minorHAnsi" w:cstheme="minorHAnsi"/>
+                          <w:color w:val="000000" w:themeColor="text1"/>
+                          <w:sz w:val="20"/>
+                          <w:szCs w:val="20"/>
+                          <w:lang w:val="en-US"/>
+                        </w:rPr>
+                        <w:t>Specialization: Web/mobile application testing, API testing, SQL, test automation fundamentals</w:t>
+                      </w:r>
+                    </w:p>
+                    <w:p>
+                      <w:pPr>
+                        <w:pStyle w:val="15"/>
+                        <w:spacing w:line="240" w:lineRule="auto"/>
+                        <w:rPr>
+                          <w:rFonts w:asciiTheme="minorHAnsi" w:hAnsiTheme="minorHAnsi" w:cstheme="minorHAnsi"/>
+                          <w:b/>
+                          <w:bCs/>
+                          <w:color w:val="000000" w:themeColor="text1"/>
+                          <w:sz w:val="20"/>
+                          <w:szCs w:val="20"/>
+                          <w:lang w:val="en-US"/>
+                        </w:rPr>
+                      </w:pPr>
+                      <w:r>
+                        <w:rPr>
+                          <w:rFonts w:asciiTheme="minorHAnsi" w:hAnsiTheme="minorHAnsi" w:cstheme="minorHAnsi"/>
+                          <w:b/>
+                          <w:bCs/>
+                          <w:color w:val="000000" w:themeColor="text1"/>
+                          <w:sz w:val="20"/>
+                          <w:szCs w:val="20"/>
+                          <w:lang w:val="en-US"/>
+                        </w:rPr>
+                        <w:t>2010-2014, Saint Petersburg</w:t>
+                      </w:r>
+                    </w:p>
+                    <w:p>
+                      <w:pPr>
+                        <w:pStyle w:val="15"/>
+                        <w:spacing w:line="240" w:lineRule="auto"/>
+                        <w:rPr>
+                          <w:rFonts w:asciiTheme="minorHAnsi" w:hAnsiTheme="minorHAnsi" w:cstheme="minorHAnsi"/>
+                          <w:b/>
+                          <w:bCs/>
+                          <w:color w:val="000000" w:themeColor="text1"/>
+                          <w:sz w:val="20"/>
+                          <w:szCs w:val="20"/>
+                          <w:lang w:val="en-US"/>
+                        </w:rPr>
+                      </w:pPr>
+                      <w:r>
+                        <w:rPr>
+                          <w:rFonts w:asciiTheme="minorHAnsi" w:hAnsiTheme="minorHAnsi" w:cstheme="minorHAnsi"/>
+                          <w:b/>
+                          <w:bCs/>
+                          <w:color w:val="000000" w:themeColor="text1"/>
+                          <w:sz w:val="20"/>
+                          <w:szCs w:val="20"/>
+                          <w:lang w:val="en-US"/>
+                        </w:rPr>
+                        <w:t xml:space="preserve">Postgraduate education </w:t>
+                      </w:r>
+                    </w:p>
+                    <w:p>
+                      <w:pPr>
+                        <w:pStyle w:val="15"/>
+                        <w:spacing w:line="240" w:lineRule="auto"/>
+                        <w:rPr>
+                          <w:rFonts w:asciiTheme="minorHAnsi" w:hAnsiTheme="minorHAnsi" w:cstheme="minorHAnsi"/>
+                          <w:color w:val="000000" w:themeColor="text1"/>
+                          <w:sz w:val="20"/>
+                          <w:szCs w:val="20"/>
+                          <w:lang w:val="en-US"/>
+                        </w:rPr>
+                      </w:pPr>
+                      <w:r>
+                        <w:rPr>
+                          <w:rFonts w:asciiTheme="minorHAnsi" w:hAnsiTheme="minorHAnsi" w:cstheme="minorHAnsi"/>
+                          <w:color w:val="000000" w:themeColor="text1"/>
+                          <w:sz w:val="20"/>
+                          <w:szCs w:val="20"/>
+                          <w:lang w:val="en-US"/>
+                        </w:rPr>
+                        <w:t>Karpinsky Russian Geological Research Institute (Karpinsky Institute, VSEGEI)</w:t>
+                      </w:r>
+                    </w:p>
+                    <w:p>
+                      <w:pPr>
+                        <w:pStyle w:val="15"/>
+                        <w:spacing w:line="240" w:lineRule="auto"/>
+                        <w:rPr>
+                          <w:rFonts w:asciiTheme="minorHAnsi" w:hAnsiTheme="minorHAnsi" w:cstheme="minorHAnsi"/>
+                          <w:color w:val="000000" w:themeColor="text1"/>
+                          <w:sz w:val="20"/>
+                          <w:szCs w:val="20"/>
+                          <w:lang w:val="en-US"/>
+                        </w:rPr>
+                      </w:pPr>
+                      <w:r>
+                        <w:rPr>
+                          <w:rFonts w:asciiTheme="minorHAnsi" w:hAnsiTheme="minorHAnsi" w:cstheme="minorHAnsi"/>
+                          <w:color w:val="000000" w:themeColor="text1"/>
+                          <w:sz w:val="20"/>
+                          <w:szCs w:val="20"/>
+                          <w:lang w:val="en-US"/>
+                        </w:rPr>
+                        <w:t>Specialization: Geology, Geological survey and Minerageny</w:t>
+                      </w:r>
+                    </w:p>
+                    <w:p>
+                      <w:pPr>
+                        <w:pStyle w:val="15"/>
+                        <w:spacing w:line="240" w:lineRule="auto"/>
+                        <w:rPr>
+                          <w:rFonts w:asciiTheme="minorHAnsi" w:hAnsiTheme="minorHAnsi" w:cstheme="minorHAnsi"/>
+                          <w:b/>
+                          <w:bCs/>
+                          <w:color w:val="000000" w:themeColor="text1"/>
+                          <w:sz w:val="20"/>
+                          <w:szCs w:val="20"/>
+                          <w:lang w:val="en-US"/>
+                        </w:rPr>
+                      </w:pPr>
+                      <w:r>
+                        <w:rPr>
+                          <w:rFonts w:asciiTheme="minorHAnsi" w:hAnsiTheme="minorHAnsi" w:cstheme="minorHAnsi"/>
+                          <w:b/>
+                          <w:bCs/>
+                          <w:color w:val="000000" w:themeColor="text1"/>
+                          <w:sz w:val="20"/>
+                          <w:szCs w:val="20"/>
+                          <w:lang w:val="en-US"/>
+                        </w:rPr>
+                        <w:t>2005 – 2010, Saint Petersburg</w:t>
+                      </w:r>
+                    </w:p>
+                    <w:p>
+                      <w:pPr>
+                        <w:pStyle w:val="15"/>
+                        <w:spacing w:line="240" w:lineRule="auto"/>
+                        <w:rPr>
+                          <w:rFonts w:asciiTheme="minorHAnsi" w:hAnsiTheme="minorHAnsi" w:cstheme="minorHAnsi"/>
+                          <w:b/>
+                          <w:bCs/>
+                          <w:color w:val="000000" w:themeColor="text1"/>
+                          <w:sz w:val="20"/>
+                          <w:szCs w:val="20"/>
+                          <w:lang w:val="en-US"/>
+                        </w:rPr>
+                      </w:pPr>
+                      <w:r>
+                        <w:rPr>
+                          <w:rFonts w:asciiTheme="minorHAnsi" w:hAnsiTheme="minorHAnsi" w:cstheme="minorHAnsi"/>
+                          <w:b/>
+                          <w:bCs/>
+                          <w:color w:val="000000" w:themeColor="text1"/>
+                          <w:sz w:val="20"/>
+                          <w:szCs w:val="20"/>
+                          <w:lang w:val="en-US"/>
+                        </w:rPr>
+                        <w:t>Mining engineer</w:t>
+                      </w:r>
+                    </w:p>
+                    <w:p>
+                      <w:pPr>
+                        <w:pStyle w:val="15"/>
+                        <w:spacing w:line="240" w:lineRule="auto"/>
+                        <w:rPr>
+                          <w:rFonts w:asciiTheme="minorHAnsi" w:hAnsiTheme="minorHAnsi" w:cstheme="minorHAnsi"/>
+                          <w:color w:val="000000" w:themeColor="text1"/>
+                          <w:sz w:val="20"/>
+                          <w:szCs w:val="20"/>
+                          <w:lang w:val="en-US"/>
+                        </w:rPr>
+                      </w:pPr>
+                      <w:r>
+                        <w:rPr>
+                          <w:rFonts w:asciiTheme="minorHAnsi" w:hAnsiTheme="minorHAnsi" w:cstheme="minorHAnsi"/>
+                          <w:color w:val="000000" w:themeColor="text1"/>
+                          <w:sz w:val="20"/>
+                          <w:szCs w:val="20"/>
+                          <w:lang w:val="en-US"/>
+                        </w:rPr>
+                        <w:t xml:space="preserve">Saint Petersburg Mining University </w:t>
+                      </w:r>
+                    </w:p>
+                    <w:p>
+                      <w:pPr>
+                        <w:pStyle w:val="15"/>
+                        <w:spacing w:line="240" w:lineRule="auto"/>
+                        <w:rPr>
+                          <w:rFonts w:asciiTheme="minorHAnsi" w:hAnsiTheme="minorHAnsi" w:cstheme="minorHAnsi"/>
+                          <w:color w:val="000000" w:themeColor="text1"/>
+                          <w:sz w:val="20"/>
+                          <w:szCs w:val="20"/>
+                          <w:lang w:val="en-US"/>
+                        </w:rPr>
+                      </w:pPr>
+                      <w:r>
+                        <w:rPr>
+                          <w:rFonts w:asciiTheme="minorHAnsi" w:hAnsiTheme="minorHAnsi" w:cstheme="minorHAnsi"/>
+                          <w:color w:val="000000" w:themeColor="text1"/>
+                          <w:sz w:val="20"/>
+                          <w:szCs w:val="20"/>
+                          <w:lang w:val="en-US"/>
+                        </w:rPr>
+                        <w:t xml:space="preserve">Specialization: Mineralogy, petrography and applied geochemistry </w:t>
+                      </w:r>
                     </w:p>
                   </w:txbxContent>
                 </v:textbox>

</xml_diff>

<commit_message>
Update English proficiency to C1 in profile and CVs
</commit_message>
<xml_diff>
--- a/public/cv/Aleksei-Pakhalko-CV-EN-2026.docx
+++ b/public/cv/Aleksei-Pakhalko-CV-EN-2026.docx
@@ -2533,7 +2533,7 @@
                                 <w:szCs w:val="20"/>
                                 <w:lang w:val="en-US"/>
                               </w:rPr>
-                              <w:t xml:space="preserve"> Russian (Native), English (Upper-Intermediate), Chinese (HSK 3, Pre-Intermediate).</w:t>
+                              <w:t xml:space="preserve"> Russian (Native), English (C1), Chinese (HSK 3, Pre-Intermediate).</w:t>
                             </w:r>
                           </w:p>
                         </w:txbxContent>
@@ -2934,7 +2934,7 @@
                           <w:szCs w:val="20"/>
                           <w:lang w:val="en-US"/>
                         </w:rPr>
-                        <w:t xml:space="preserve"> Russian (Native), English (Upper-Intermediate), Chinese (HSK 3, Pre-Intermediate).</w:t>
+                        <w:t xml:space="preserve"> Russian (Native), English (C1), Chinese (HSK 3, Pre-Intermediate).</w:t>
                       </w:r>
                     </w:p>
                   </w:txbxContent>

</xml_diff>